<commit_message>
Apply moisture-corrected biochar yield and sync updated CTCdata.
Biochar potential = yield × residue × (100−initial moisture)/(100−final moisture); load Initial_moisture and Final_moisture from Conversion_parameters.

Co-authored-by: Cursor <cursoragent@cursor.com>
</commit_message>
<xml_diff>
--- a/data/Intro&Ref of SusTool.docx
+++ b/data/Intro&Ref of SusTool.docx
@@ -1,6 +1,6 @@
 
 <file path=word/document.xml><?xml version="1.0" encoding="utf-8"?>
-<w:document xmlns:wpc="http://schemas.microsoft.com/office/word/2010/wordprocessingCanvas" xmlns:cx="http://schemas.microsoft.com/office/drawing/2014/chartex" xmlns:cx1="http://schemas.microsoft.com/office/drawing/2015/9/8/chartex" xmlns:cx2="http://schemas.microsoft.com/office/drawing/2015/10/21/chartex" xmlns:cx3="http://schemas.microsoft.com/office/drawing/2016/5/9/chartex" xmlns:cx4="http://schemas.microsoft.com/office/drawing/2016/5/10/chartex" xmlns:cx5="http://schemas.microsoft.com/office/drawing/2016/5/11/chartex" xmlns:cx6="http://schemas.microsoft.com/office/drawing/2016/5/12/chartex" xmlns:cx7="http://schemas.microsoft.com/office/drawing/2016/5/13/chartex" xmlns:cx8="http://schemas.microsoft.com/office/drawing/2016/5/14/chartex" xmlns:mc="http://schemas.openxmlformats.org/markup-compatibility/2006" xmlns:aink="http://schemas.microsoft.com/office/drawing/2016/ink" xmlns:am3d="http://schemas.microsoft.com/office/drawing/2017/model3d" xmlns:o="urn:schemas-microsoft-com:office:office" xmlns:oel="http://schemas.microsoft.com/office/2019/extlst" xmlns:r="http://schemas.openxmlformats.org/officeDocument/2006/relationships" xmlns:m="http://schemas.openxmlformats.org/officeDocument/2006/math" xmlns:v="urn:schemas-microsoft-com:vml" xmlns:wp14="http://schemas.microsoft.com/office/word/2010/wordprocessingDrawing" xmlns:wp="http://schemas.openxmlformats.org/drawingml/2006/wordprocessingDrawing" xmlns:w10="urn:schemas-microsoft-com:office:word" xmlns:w="http://schemas.openxmlformats.org/wordprocessingml/2006/main" xmlns:w14="http://schemas.microsoft.com/office/word/2010/wordml" xmlns:w15="http://schemas.microsoft.com/office/word/2012/wordml" xmlns:w16cex="http://schemas.microsoft.com/office/word/2018/wordml/cex" xmlns:w16cid="http://schemas.microsoft.com/office/word/2016/wordml/cid" xmlns:w16="http://schemas.microsoft.com/office/word/2018/wordml" xmlns:w16du="http://schemas.microsoft.com/office/word/2023/wordml/word16du" xmlns:w16sdtdh="http://schemas.microsoft.com/office/word/2020/wordml/sdtdatahash" xmlns:w16sdtfl="http://schemas.microsoft.com/office/word/2024/wordml/sdtformatlock" xmlns:w16se="http://schemas.microsoft.com/office/word/2015/wordml/symex" xmlns:wpg="http://schemas.microsoft.com/office/word/2010/wordprocessingGroup" xmlns:wpi="http://schemas.microsoft.com/office/word/2010/wordprocessingInk" xmlns:wne="http://schemas.microsoft.com/office/word/2006/wordml" xmlns:wps="http://schemas.microsoft.com/office/word/2010/wordprocessingShape" mc:Ignorable="w14 w15 w16se w16cid w16 w16cex w16sdtdh w16sdtfl w16du wp14">
+<w:document xmlns:wpc="http://schemas.microsoft.com/office/word/2010/wordprocessingCanvas" xmlns:cx="http://schemas.microsoft.com/office/drawing/2014/chartex" xmlns:cx1="http://schemas.microsoft.com/office/drawing/2015/9/8/chartex" xmlns:cx2="http://schemas.microsoft.com/office/drawing/2015/10/21/chartex" xmlns:cx3="http://schemas.microsoft.com/office/drawing/2016/5/9/chartex" xmlns:cx4="http://schemas.microsoft.com/office/drawing/2016/5/10/chartex" xmlns:cx5="http://schemas.microsoft.com/office/drawing/2016/5/11/chartex" xmlns:cx6="http://schemas.microsoft.com/office/drawing/2016/5/12/chartex" xmlns:cx7="http://schemas.microsoft.com/office/drawing/2016/5/13/chartex" xmlns:cx8="http://schemas.microsoft.com/office/drawing/2016/5/14/chartex" xmlns:mc="http://schemas.openxmlformats.org/markup-compatibility/2006" xmlns:aink="http://schemas.microsoft.com/office/drawing/2016/ink" xmlns:am3d="http://schemas.microsoft.com/office/drawing/2017/model3d" xmlns:o="urn:schemas-microsoft-com:office:office" xmlns:r="http://schemas.openxmlformats.org/officeDocument/2006/relationships" xmlns:m="http://schemas.openxmlformats.org/officeDocument/2006/math" xmlns:v="urn:schemas-microsoft-com:vml" xmlns:wp14="http://schemas.microsoft.com/office/word/2010/wordprocessingDrawing" xmlns:wp="http://schemas.openxmlformats.org/drawingml/2006/wordprocessingDrawing" xmlns:w10="urn:schemas-microsoft-com:office:word" xmlns:w="http://schemas.openxmlformats.org/wordprocessingml/2006/main" xmlns:w14="http://schemas.microsoft.com/office/word/2010/wordml" xmlns:w15="http://schemas.microsoft.com/office/word/2012/wordml" xmlns:w16cex="http://schemas.microsoft.com/office/word/2018/wordml/cex" xmlns:w16cid="http://schemas.microsoft.com/office/word/2016/wordml/cid" xmlns:w16="http://schemas.microsoft.com/office/word/2018/wordml" xmlns:w16sdtdh="http://schemas.microsoft.com/office/word/2020/wordml/sdtdatahash" xmlns:w16se="http://schemas.microsoft.com/office/word/2015/wordml/symex" xmlns:wpg="http://schemas.microsoft.com/office/word/2010/wordprocessingGroup" xmlns:wpi="http://schemas.microsoft.com/office/word/2010/wordprocessingInk" xmlns:wne="http://schemas.microsoft.com/office/word/2006/wordml" xmlns:wps="http://schemas.microsoft.com/office/word/2010/wordprocessingShape" mc:Ignorable="w14 w15 w16se w16cid w16 w16cex w16sdtdh wp14">
   <w:body>
     <w:p>
       <w:pPr>
@@ -206,6 +206,14 @@
         </w:rPr>
         <w:t>establishing and developing sustainable cyclical value chains for functional biobased chemicals/materials/nutraceuticals.</w:t>
       </w:r>
+      <w:r>
+        <w:rPr>
+          <w:rFonts w:ascii="Times New Roman" w:hAnsi="Times New Roman" w:cs="Times New Roman"/>
+          <w:sz w:val="22"/>
+          <w:szCs w:val="22"/>
+        </w:rPr>
+        <w:t xml:space="preserve"> </w:t>
+      </w:r>
     </w:p>
     <w:p>
       <w:pPr>
@@ -296,6 +304,67 @@
         </w:rPr>
         <w:t>Sustainability Tool is an informational portal aimed to facilitate sustainable valorization of residues and green waste from horticulture industry and nest solutions for circularity of renewable carbon in local economies (southern Netherlands and Flanders).</w:t>
       </w:r>
+      <w:r>
+        <w:rPr>
+          <w:rFonts w:ascii="Times New Roman" w:hAnsi="Times New Roman" w:cs="Times New Roman"/>
+          <w:sz w:val="22"/>
+          <w:szCs w:val="22"/>
+        </w:rPr>
+        <w:fldChar w:fldCharType="begin"/>
+      </w:r>
+      <w:r>
+        <w:rPr>
+          <w:rFonts w:ascii="Times New Roman" w:hAnsi="Times New Roman" w:cs="Times New Roman"/>
+          <w:sz w:val="22"/>
+          <w:szCs w:val="22"/>
+        </w:rPr>
+        <w:instrText xml:space="preserve"> ADDIN ZOTERO_ITEM CSL_CITATION {"citationID":"kNvLHMXl","properties":{"formattedCitation":"(Ghiat et al., 2022)","plainCitation":"(Ghiat et al., 2022)","noteIndex":0},"citationItems":[{"id":11662,"uris":["http://zotero.org/users/9345239/items/ATZTYT3J"],"itemData":{"id":11662,"type":"article-journal","abstract":"Cucumber waste from the greenhouse is a nutrient and high cellulose-rich biomass that could potentially be used to produce biochar as a valuable resource. Therefore, this study was conducted to produce biochar from cucumber green waste collected from a greenhouse in Qatar. The green waste was cut into small pieces (5 to 10 cm) for oven drying at a temperature of 105 °C for 24 h to remove moisture and was then pyrolysed in a muffle furnace at three temperatures of 300, 350, and 550 °C with a heating rate of 5 °C min-1 and residence time of 30 min. This study focuses on the nutrient analysis of biochar, including yield, pH and electrical conductivity (EC). Additionally, a small-scale pot test with cucumber plants applied 0% (control) and 2% biochar to a coco-peat substrate under a controlled microclimate with an enriched CO2 environment of 1000 ppm in a climate chamber. The pots were irrigated with a nutrient rich solution. Results demonstrate that the biochar produced with a higher pyrolysis temperature has a higher C content of 71%, pH of 10.59 and EC of 12.93 mS cm-1 with more aluminium, copper, and manganese. The lower pyrolysis temperature biochar possessed a higher N content of 3% and improved biochar yield of 48% with maximum potassium and iron concentrations. The application of 2% biochar was found to be linked to a maximum increase of 39% in plant height, 32% in leaf area, 3% in chlorophyll content, and a reduction of 71% in water loss by drainage as compared to the control. Moreover, both low and high temperature biochar applications display good plant growth by reducing water loss, while nutrient loss was more significant in the 2% biochar application at all three temperature conditions than the control. This study demonstrates that a lower fraction of biochar application could be beneficial for sustainable agricultural practices to reduce water drainage and nutrient supply.Keywords: Cucumber; Green waste; Biochar; Plant growth; Water loss; Nutrients lea","container-title":"Chemical Engineering Transactions","DOI":"10.3303/CET2292056","ISSN":"2283-9216","language":"en","license":"Copyright (c) 2022 AIDIC Servizi Srl","page":"331-336","source":"www.cetjournal.it","title":"Biochar: a Sustainable Approach of Green Waste Management in Agricultural Practices Under Controlled Microclimate","title-short":"Biochar","volume":"92","author":[{"family":"Ghiat","given":"Ikhlas"},{"family":"Pradhan","given":"Snigdhendubala"},{"family":"Govindan","given":"Rajesh"},{"family":"Mackey","given":"Hamish R."},{"family":"Mckay","given":"Gordon"},{"family":"Al-Ansari","given":"Tareq"}],"issued":{"date-parts":[["2022",6,30]]}}}],"schema":"https://github.com/citation-style-language/schema/raw/master/csl-citation.json"} </w:instrText>
+      </w:r>
+      <w:r>
+        <w:rPr>
+          <w:rFonts w:ascii="Times New Roman" w:hAnsi="Times New Roman" w:cs="Times New Roman"/>
+          <w:sz w:val="22"/>
+          <w:szCs w:val="22"/>
+        </w:rPr>
+        <w:fldChar w:fldCharType="separate"/>
+      </w:r>
+      <w:r>
+        <w:rPr>
+          <w:rFonts w:ascii="Times New Roman" w:hAnsi="Times New Roman" w:cs="Times New Roman"/>
+          <w:noProof/>
+          <w:sz w:val="22"/>
+          <w:szCs w:val="22"/>
+        </w:rPr>
+        <w:t>(</w:t>
+      </w:r>
+      <w:proofErr w:type="spellStart"/>
+      <w:r>
+        <w:rPr>
+          <w:rFonts w:ascii="Times New Roman" w:hAnsi="Times New Roman" w:cs="Times New Roman"/>
+          <w:noProof/>
+          <w:sz w:val="22"/>
+          <w:szCs w:val="22"/>
+        </w:rPr>
+        <w:t>Ghiat</w:t>
+      </w:r>
+      <w:proofErr w:type="spellEnd"/>
+      <w:r>
+        <w:rPr>
+          <w:rFonts w:ascii="Times New Roman" w:hAnsi="Times New Roman" w:cs="Times New Roman"/>
+          <w:noProof/>
+          <w:sz w:val="22"/>
+          <w:szCs w:val="22"/>
+        </w:rPr>
+        <w:t xml:space="preserve"> et al., 2022)</w:t>
+      </w:r>
+      <w:r>
+        <w:rPr>
+          <w:rFonts w:ascii="Times New Roman" w:hAnsi="Times New Roman" w:cs="Times New Roman"/>
+          <w:sz w:val="22"/>
+          <w:szCs w:val="22"/>
+        </w:rPr>
+        <w:fldChar w:fldCharType="end"/>
+      </w:r>
     </w:p>
     <w:p>
       <w:pPr>
@@ -334,6 +403,46 @@
         </w:rPr>
         <w:t>: to visualize horticultural biomass (production and residue) and potential inventory of residue-based products (biochar, compost, coumaric acids) at provincial level of year 2022.</w:t>
       </w:r>
+      <w:r>
+        <w:rPr>
+          <w:rFonts w:ascii="Times New Roman" w:hAnsi="Times New Roman" w:cs="Times New Roman"/>
+          <w:sz w:val="22"/>
+          <w:szCs w:val="22"/>
+        </w:rPr>
+        <w:fldChar w:fldCharType="begin"/>
+      </w:r>
+      <w:r>
+        <w:rPr>
+          <w:rFonts w:ascii="Times New Roman" w:hAnsi="Times New Roman" w:cs="Times New Roman"/>
+          <w:sz w:val="22"/>
+          <w:szCs w:val="22"/>
+        </w:rPr>
+        <w:instrText xml:space="preserve"> ADDIN ZOTERO_TEMP </w:instrText>
+      </w:r>
+      <w:r>
+        <w:rPr>
+          <w:rFonts w:ascii="Times New Roman" w:hAnsi="Times New Roman" w:cs="Times New Roman"/>
+          <w:sz w:val="22"/>
+          <w:szCs w:val="22"/>
+        </w:rPr>
+        <w:fldChar w:fldCharType="separate"/>
+      </w:r>
+      <w:r>
+        <w:rPr>
+          <w:rFonts w:ascii="Times New Roman" w:hAnsi="Times New Roman" w:cs="Times New Roman"/>
+          <w:sz w:val="22"/>
+          <w:szCs w:val="22"/>
+        </w:rPr>
+        <w:fldChar w:fldCharType="end"/>
+      </w:r>
+      <w:r>
+        <w:rPr>
+          <w:rFonts w:ascii="Times New Roman" w:hAnsi="Times New Roman" w:cs="Times New Roman"/>
+          <w:sz w:val="22"/>
+          <w:szCs w:val="22"/>
+        </w:rPr>
+        <w:t xml:space="preserve"> </w:t>
+      </w:r>
     </w:p>
     <w:p>
       <w:pPr>
@@ -388,7 +497,7 @@
     </w:p>
     <w:p>
       <w:pPr>
-        <w:pStyle w:val="Bibliography"/>
+        <w:pStyle w:val="ae"/>
         <w:rPr>
           <w:rFonts w:ascii="Times New Roman" w:hAnsi="Times New Roman" w:cs="Times New Roman"/>
           <w:sz w:val="22"/>
@@ -701,12 +810,23 @@
           <w:szCs w:val="22"/>
           <w:lang w:val="nl-NL"/>
         </w:rPr>
-        <w:t>(6), e27713. https://doi.org/10.1016/j.heliyon.2024.e27713</w:t>
-      </w:r>
+        <w:t xml:space="preserve">(6), e27713. </w:t>
+      </w:r>
+      <w:proofErr w:type="gramStart"/>
+      <w:r>
+        <w:rPr>
+          <w:rFonts w:ascii="Times New Roman" w:hAnsi="Times New Roman" w:cs="Times New Roman"/>
+          <w:sz w:val="22"/>
+          <w:szCs w:val="22"/>
+          <w:lang w:val="nl-NL"/>
+        </w:rPr>
+        <w:t>https://doi.org/10.1016/j.heliyon.2024.e27713</w:t>
+      </w:r>
+      <w:proofErr w:type="gramEnd"/>
     </w:p>
     <w:p>
       <w:pPr>
-        <w:pStyle w:val="Bibliography"/>
+        <w:pStyle w:val="ae"/>
         <w:rPr>
           <w:rFonts w:ascii="Times New Roman" w:hAnsi="Times New Roman" w:cs="Times New Roman"/>
           <w:sz w:val="22"/>
@@ -1183,12 +1303,23 @@
           <w:szCs w:val="22"/>
           <w:lang w:val="nl-NL"/>
         </w:rPr>
-        <w:t>, 107293. https://doi.org/10.1016/j.biombioe.2024.107293</w:t>
-      </w:r>
+        <w:t xml:space="preserve">, 107293. </w:t>
+      </w:r>
+      <w:proofErr w:type="gramStart"/>
+      <w:r>
+        <w:rPr>
+          <w:rFonts w:ascii="Times New Roman" w:hAnsi="Times New Roman" w:cs="Times New Roman"/>
+          <w:sz w:val="22"/>
+          <w:szCs w:val="22"/>
+          <w:lang w:val="nl-NL"/>
+        </w:rPr>
+        <w:t>https://doi.org/10.1016/j.biombioe.2024.107293</w:t>
+      </w:r>
+      <w:proofErr w:type="gramEnd"/>
     </w:p>
     <w:p>
       <w:pPr>
-        <w:pStyle w:val="Bibliography"/>
+        <w:pStyle w:val="ae"/>
         <w:rPr>
           <w:rFonts w:ascii="Times New Roman" w:hAnsi="Times New Roman" w:cs="Times New Roman"/>
           <w:sz w:val="22"/>
@@ -1504,12 +1635,23 @@
           <w:szCs w:val="22"/>
           <w:lang w:val="nl-NL"/>
         </w:rPr>
-        <w:t>, 105946. https://doi.org/10.1016/j.biombioe.2020.105946</w:t>
-      </w:r>
+        <w:t xml:space="preserve">, 105946. </w:t>
+      </w:r>
+      <w:proofErr w:type="gramStart"/>
+      <w:r>
+        <w:rPr>
+          <w:rFonts w:ascii="Times New Roman" w:hAnsi="Times New Roman" w:cs="Times New Roman"/>
+          <w:sz w:val="22"/>
+          <w:szCs w:val="22"/>
+          <w:lang w:val="nl-NL"/>
+        </w:rPr>
+        <w:t>https://doi.org/10.1016/j.biombioe.2020.105946</w:t>
+      </w:r>
+      <w:proofErr w:type="gramEnd"/>
     </w:p>
     <w:p>
       <w:pPr>
-        <w:pStyle w:val="Bibliography"/>
+        <w:pStyle w:val="ae"/>
         <w:rPr>
           <w:rFonts w:ascii="Times New Roman" w:hAnsi="Times New Roman" w:cs="Times New Roman"/>
           <w:sz w:val="22"/>
@@ -1755,17 +1897,26 @@
           <w:szCs w:val="22"/>
           <w:lang w:val="nl-NL"/>
         </w:rPr>
-        <w:t>, 133489. https://doi.org/10.1016/j.energy.2024.133489</w:t>
-      </w:r>
+        <w:t xml:space="preserve">, 133489. </w:t>
+      </w:r>
+      <w:proofErr w:type="gramStart"/>
+      <w:r>
+        <w:rPr>
+          <w:rFonts w:ascii="Times New Roman" w:hAnsi="Times New Roman" w:cs="Times New Roman"/>
+          <w:sz w:val="22"/>
+          <w:szCs w:val="22"/>
+          <w:lang w:val="nl-NL"/>
+        </w:rPr>
+        <w:t>https://doi.org/10.1016/j.energy.2024.133489</w:t>
+      </w:r>
+      <w:proofErr w:type="gramEnd"/>
     </w:p>
     <w:p>
       <w:pPr>
-        <w:pStyle w:val="Bibliography"/>
-        <w:rPr>
-          <w:rFonts w:ascii="Times New Roman" w:hAnsi="Times New Roman" w:cs="Times New Roman"/>
-          <w:sz w:val="22"/>
-          <w:szCs w:val="22"/>
-          <w:lang w:val="nl-NL"/>
+        <w:pStyle w:val="ae"/>
+        <w:rPr>
+          <w:rFonts w:ascii="Times New Roman" w:hAnsi="Times New Roman" w:cs="Times New Roman"/>
+          <w:sz w:val="22"/>
         </w:rPr>
       </w:pPr>
       <w:proofErr w:type="spellStart"/>
@@ -1773,459 +1924,285 @@
         <w:rPr>
           <w:rFonts w:ascii="Times New Roman" w:hAnsi="Times New Roman" w:cs="Times New Roman"/>
           <w:sz w:val="22"/>
-          <w:szCs w:val="22"/>
-          <w:lang w:val="nl-NL"/>
-        </w:rPr>
-        <w:t>Laougé</w:t>
-      </w:r>
-      <w:proofErr w:type="spellEnd"/>
-      <w:r>
-        <w:rPr>
-          <w:rFonts w:ascii="Times New Roman" w:hAnsi="Times New Roman" w:cs="Times New Roman"/>
-          <w:sz w:val="22"/>
-          <w:szCs w:val="22"/>
-          <w:lang w:val="nl-NL"/>
-        </w:rPr>
-        <w:t xml:space="preserve">, Z. B., </w:t>
-      </w:r>
-      <w:proofErr w:type="spellStart"/>
-      <w:r>
-        <w:rPr>
-          <w:rFonts w:ascii="Times New Roman" w:hAnsi="Times New Roman" w:cs="Times New Roman"/>
-          <w:sz w:val="22"/>
-          <w:szCs w:val="22"/>
-          <w:lang w:val="nl-NL"/>
-        </w:rPr>
-        <w:t>Karademir</w:t>
-      </w:r>
-      <w:proofErr w:type="spellEnd"/>
-      <w:r>
-        <w:rPr>
-          <w:rFonts w:ascii="Times New Roman" w:hAnsi="Times New Roman" w:cs="Times New Roman"/>
-          <w:sz w:val="22"/>
-          <w:szCs w:val="22"/>
-          <w:lang w:val="nl-NL"/>
-        </w:rPr>
-        <w:t xml:space="preserve">, F. S., &amp; </w:t>
-      </w:r>
-      <w:proofErr w:type="spellStart"/>
-      <w:r>
-        <w:rPr>
-          <w:rFonts w:ascii="Times New Roman" w:hAnsi="Times New Roman" w:cs="Times New Roman"/>
-          <w:sz w:val="22"/>
-          <w:szCs w:val="22"/>
-          <w:lang w:val="nl-NL"/>
-        </w:rPr>
-        <w:t>Merdun</w:t>
-      </w:r>
-      <w:proofErr w:type="spellEnd"/>
-      <w:r>
-        <w:rPr>
-          <w:rFonts w:ascii="Times New Roman" w:hAnsi="Times New Roman" w:cs="Times New Roman"/>
-          <w:sz w:val="22"/>
-          <w:szCs w:val="22"/>
-          <w:lang w:val="nl-NL"/>
-        </w:rPr>
-        <w:t xml:space="preserve">, H. (2023). </w:t>
-      </w:r>
-      <w:proofErr w:type="spellStart"/>
-      <w:r>
-        <w:rPr>
-          <w:rFonts w:ascii="Times New Roman" w:hAnsi="Times New Roman" w:cs="Times New Roman"/>
-          <w:sz w:val="22"/>
-          <w:szCs w:val="22"/>
-          <w:lang w:val="nl-NL"/>
-        </w:rPr>
-        <w:t>Production</w:t>
-      </w:r>
-      <w:proofErr w:type="spellEnd"/>
-      <w:r>
-        <w:rPr>
-          <w:rFonts w:ascii="Times New Roman" w:hAnsi="Times New Roman" w:cs="Times New Roman"/>
-          <w:sz w:val="22"/>
-          <w:szCs w:val="22"/>
-          <w:lang w:val="nl-NL"/>
-        </w:rPr>
-        <w:t xml:space="preserve"> </w:t>
-      </w:r>
-      <w:proofErr w:type="spellStart"/>
-      <w:r>
-        <w:rPr>
-          <w:rFonts w:ascii="Times New Roman" w:hAnsi="Times New Roman" w:cs="Times New Roman"/>
-          <w:sz w:val="22"/>
-          <w:szCs w:val="22"/>
-          <w:lang w:val="nl-NL"/>
-        </w:rPr>
-        <w:t>and</w:t>
-      </w:r>
-      <w:proofErr w:type="spellEnd"/>
-      <w:r>
-        <w:rPr>
-          <w:rFonts w:ascii="Times New Roman" w:hAnsi="Times New Roman" w:cs="Times New Roman"/>
-          <w:sz w:val="22"/>
-          <w:szCs w:val="22"/>
-          <w:lang w:val="nl-NL"/>
-        </w:rPr>
-        <w:t xml:space="preserve"> </w:t>
-      </w:r>
-      <w:proofErr w:type="spellStart"/>
-      <w:r>
-        <w:rPr>
-          <w:rFonts w:ascii="Times New Roman" w:hAnsi="Times New Roman" w:cs="Times New Roman"/>
-          <w:sz w:val="22"/>
-          <w:szCs w:val="22"/>
-          <w:lang w:val="nl-NL"/>
-        </w:rPr>
-        <w:t>characterization</w:t>
-      </w:r>
-      <w:proofErr w:type="spellEnd"/>
-      <w:r>
-        <w:rPr>
-          <w:rFonts w:ascii="Times New Roman" w:hAnsi="Times New Roman" w:cs="Times New Roman"/>
-          <w:sz w:val="22"/>
-          <w:szCs w:val="22"/>
-          <w:lang w:val="nl-NL"/>
-        </w:rPr>
-        <w:t xml:space="preserve"> of bio-</w:t>
-      </w:r>
-      <w:proofErr w:type="spellStart"/>
-      <w:r>
-        <w:rPr>
-          <w:rFonts w:ascii="Times New Roman" w:hAnsi="Times New Roman" w:cs="Times New Roman"/>
-          <w:sz w:val="22"/>
-          <w:szCs w:val="22"/>
-          <w:lang w:val="nl-NL"/>
-        </w:rPr>
-        <w:t>oil</w:t>
-      </w:r>
-      <w:proofErr w:type="spellEnd"/>
-      <w:r>
-        <w:rPr>
-          <w:rFonts w:ascii="Times New Roman" w:hAnsi="Times New Roman" w:cs="Times New Roman"/>
-          <w:sz w:val="22"/>
-          <w:szCs w:val="22"/>
-          <w:lang w:val="nl-NL"/>
-        </w:rPr>
-        <w:t xml:space="preserve"> </w:t>
-      </w:r>
-      <w:proofErr w:type="spellStart"/>
-      <w:r>
-        <w:rPr>
-          <w:rFonts w:ascii="Times New Roman" w:hAnsi="Times New Roman" w:cs="Times New Roman"/>
-          <w:sz w:val="22"/>
-          <w:szCs w:val="22"/>
-          <w:lang w:val="nl-NL"/>
-        </w:rPr>
-        <w:t>from</w:t>
-      </w:r>
-      <w:proofErr w:type="spellEnd"/>
-      <w:r>
-        <w:rPr>
-          <w:rFonts w:ascii="Times New Roman" w:hAnsi="Times New Roman" w:cs="Times New Roman"/>
-          <w:sz w:val="22"/>
-          <w:szCs w:val="22"/>
-          <w:lang w:val="nl-NL"/>
-        </w:rPr>
-        <w:t xml:space="preserve"> </w:t>
-      </w:r>
-      <w:proofErr w:type="spellStart"/>
-      <w:r>
-        <w:rPr>
-          <w:rFonts w:ascii="Times New Roman" w:hAnsi="Times New Roman" w:cs="Times New Roman"/>
-          <w:sz w:val="22"/>
-          <w:szCs w:val="22"/>
-          <w:lang w:val="nl-NL"/>
-        </w:rPr>
-        <w:t>catalytic</w:t>
-      </w:r>
-      <w:proofErr w:type="spellEnd"/>
-      <w:r>
-        <w:rPr>
-          <w:rFonts w:ascii="Times New Roman" w:hAnsi="Times New Roman" w:cs="Times New Roman"/>
-          <w:sz w:val="22"/>
-          <w:szCs w:val="22"/>
-          <w:lang w:val="nl-NL"/>
-        </w:rPr>
-        <w:t xml:space="preserve"> </w:t>
-      </w:r>
-      <w:proofErr w:type="spellStart"/>
-      <w:r>
-        <w:rPr>
-          <w:rFonts w:ascii="Times New Roman" w:hAnsi="Times New Roman" w:cs="Times New Roman"/>
-          <w:sz w:val="22"/>
-          <w:szCs w:val="22"/>
-          <w:lang w:val="nl-NL"/>
-        </w:rPr>
-        <w:t>fast</w:t>
-      </w:r>
-      <w:proofErr w:type="spellEnd"/>
-      <w:r>
-        <w:rPr>
-          <w:rFonts w:ascii="Times New Roman" w:hAnsi="Times New Roman" w:cs="Times New Roman"/>
-          <w:sz w:val="22"/>
-          <w:szCs w:val="22"/>
-          <w:lang w:val="nl-NL"/>
-        </w:rPr>
-        <w:t xml:space="preserve"> </w:t>
-      </w:r>
-      <w:proofErr w:type="spellStart"/>
-      <w:r>
-        <w:rPr>
-          <w:rFonts w:ascii="Times New Roman" w:hAnsi="Times New Roman" w:cs="Times New Roman"/>
-          <w:sz w:val="22"/>
-          <w:szCs w:val="22"/>
-          <w:lang w:val="nl-NL"/>
-        </w:rPr>
-        <w:t>pyrolysis</w:t>
-      </w:r>
-      <w:proofErr w:type="spellEnd"/>
-      <w:r>
-        <w:rPr>
-          <w:rFonts w:ascii="Times New Roman" w:hAnsi="Times New Roman" w:cs="Times New Roman"/>
-          <w:sz w:val="22"/>
-          <w:szCs w:val="22"/>
-          <w:lang w:val="nl-NL"/>
-        </w:rPr>
-        <w:t xml:space="preserve"> of </w:t>
-      </w:r>
-      <w:proofErr w:type="spellStart"/>
-      <w:r>
-        <w:rPr>
-          <w:rFonts w:ascii="Times New Roman" w:hAnsi="Times New Roman" w:cs="Times New Roman"/>
-          <w:sz w:val="22"/>
-          <w:szCs w:val="22"/>
-          <w:lang w:val="nl-NL"/>
-        </w:rPr>
-        <w:t>greenhouse</w:t>
-      </w:r>
-      <w:proofErr w:type="spellEnd"/>
-      <w:r>
-        <w:rPr>
-          <w:rFonts w:ascii="Times New Roman" w:hAnsi="Times New Roman" w:cs="Times New Roman"/>
-          <w:sz w:val="22"/>
-          <w:szCs w:val="22"/>
-          <w:lang w:val="nl-NL"/>
-        </w:rPr>
-        <w:t xml:space="preserve"> </w:t>
-      </w:r>
-      <w:proofErr w:type="spellStart"/>
-      <w:r>
-        <w:rPr>
-          <w:rFonts w:ascii="Times New Roman" w:hAnsi="Times New Roman" w:cs="Times New Roman"/>
-          <w:sz w:val="22"/>
-          <w:szCs w:val="22"/>
-          <w:lang w:val="nl-NL"/>
-        </w:rPr>
-        <w:t>vegetables</w:t>
-      </w:r>
-      <w:proofErr w:type="spellEnd"/>
-      <w:r>
-        <w:rPr>
-          <w:rFonts w:ascii="Times New Roman" w:hAnsi="Times New Roman" w:cs="Times New Roman"/>
-          <w:sz w:val="22"/>
-          <w:szCs w:val="22"/>
-          <w:lang w:val="nl-NL"/>
-        </w:rPr>
-        <w:t xml:space="preserve"> </w:t>
-      </w:r>
-      <w:proofErr w:type="spellStart"/>
-      <w:r>
-        <w:rPr>
-          <w:rFonts w:ascii="Times New Roman" w:hAnsi="Times New Roman" w:cs="Times New Roman"/>
-          <w:sz w:val="22"/>
-          <w:szCs w:val="22"/>
-          <w:lang w:val="nl-NL"/>
-        </w:rPr>
-        <w:t>wastes</w:t>
-      </w:r>
-      <w:proofErr w:type="spellEnd"/>
-      <w:r>
-        <w:rPr>
-          <w:rFonts w:ascii="Times New Roman" w:hAnsi="Times New Roman" w:cs="Times New Roman"/>
-          <w:sz w:val="22"/>
-          <w:szCs w:val="22"/>
-          <w:lang w:val="nl-NL"/>
-        </w:rPr>
-        <w:t xml:space="preserve">. </w:t>
-      </w:r>
-      <w:proofErr w:type="spellStart"/>
+        </w:rPr>
+        <w:t>Ghiat</w:t>
+      </w:r>
+      <w:proofErr w:type="spellEnd"/>
+      <w:r>
+        <w:rPr>
+          <w:rFonts w:ascii="Times New Roman" w:hAnsi="Times New Roman" w:cs="Times New Roman"/>
+          <w:sz w:val="22"/>
+        </w:rPr>
+        <w:t xml:space="preserve">, I., Pradhan, S., Govindan, R., Mackey, H. R., </w:t>
+      </w:r>
+      <w:proofErr w:type="spellStart"/>
+      <w:r>
+        <w:rPr>
+          <w:rFonts w:ascii="Times New Roman" w:hAnsi="Times New Roman" w:cs="Times New Roman"/>
+          <w:sz w:val="22"/>
+        </w:rPr>
+        <w:t>Mckay</w:t>
+      </w:r>
+      <w:proofErr w:type="spellEnd"/>
+      <w:r>
+        <w:rPr>
+          <w:rFonts w:ascii="Times New Roman" w:hAnsi="Times New Roman" w:cs="Times New Roman"/>
+          <w:sz w:val="22"/>
+        </w:rPr>
+        <w:t xml:space="preserve">, G., &amp; Al-Ansari, T. (2022). Biochar: A Sustainable Approach of Green Waste Management in Agricultural Practices Under Controlled Microclimate. </w:t>
+      </w:r>
       <w:r>
         <w:rPr>
           <w:rFonts w:ascii="Times New Roman" w:hAnsi="Times New Roman" w:cs="Times New Roman"/>
           <w:i/>
           <w:iCs/>
           <w:sz w:val="22"/>
-          <w:szCs w:val="22"/>
-          <w:lang w:val="nl-NL"/>
-        </w:rPr>
-        <w:t>Biomass</w:t>
-      </w:r>
-      <w:proofErr w:type="spellEnd"/>
+        </w:rPr>
+        <w:t>Chemical Engineering Transactions</w:t>
+      </w:r>
+      <w:r>
+        <w:rPr>
+          <w:rFonts w:ascii="Times New Roman" w:hAnsi="Times New Roman" w:cs="Times New Roman"/>
+          <w:sz w:val="22"/>
+        </w:rPr>
+        <w:t xml:space="preserve">, </w:t>
+      </w:r>
       <w:r>
         <w:rPr>
           <w:rFonts w:ascii="Times New Roman" w:hAnsi="Times New Roman" w:cs="Times New Roman"/>
           <w:i/>
           <w:iCs/>
           <w:sz w:val="22"/>
-          <w:szCs w:val="22"/>
-          <w:lang w:val="nl-NL"/>
-        </w:rPr>
-        <w:t xml:space="preserve"> Conversion </w:t>
-      </w:r>
-      <w:proofErr w:type="spellStart"/>
-      <w:r>
-        <w:rPr>
-          <w:rFonts w:ascii="Times New Roman" w:hAnsi="Times New Roman" w:cs="Times New Roman"/>
-          <w:i/>
-          <w:iCs/>
-          <w:sz w:val="22"/>
-          <w:szCs w:val="22"/>
-          <w:lang w:val="nl-NL"/>
-        </w:rPr>
-        <w:t>and</w:t>
-      </w:r>
-      <w:proofErr w:type="spellEnd"/>
-      <w:r>
-        <w:rPr>
-          <w:rFonts w:ascii="Times New Roman" w:hAnsi="Times New Roman" w:cs="Times New Roman"/>
-          <w:i/>
-          <w:iCs/>
-          <w:sz w:val="22"/>
-          <w:szCs w:val="22"/>
-          <w:lang w:val="nl-NL"/>
-        </w:rPr>
-        <w:t xml:space="preserve"> </w:t>
-      </w:r>
-      <w:proofErr w:type="spellStart"/>
-      <w:r>
-        <w:rPr>
-          <w:rFonts w:ascii="Times New Roman" w:hAnsi="Times New Roman" w:cs="Times New Roman"/>
-          <w:i/>
-          <w:iCs/>
-          <w:sz w:val="22"/>
-          <w:szCs w:val="22"/>
-          <w:lang w:val="nl-NL"/>
-        </w:rPr>
-        <w:t>Biorefinery</w:t>
-      </w:r>
-      <w:proofErr w:type="spellEnd"/>
-      <w:r>
-        <w:rPr>
-          <w:rFonts w:ascii="Times New Roman" w:hAnsi="Times New Roman" w:cs="Times New Roman"/>
-          <w:sz w:val="22"/>
-          <w:szCs w:val="22"/>
-          <w:lang w:val="nl-NL"/>
-        </w:rPr>
-        <w:t xml:space="preserve">, </w:t>
-      </w:r>
-      <w:r>
-        <w:rPr>
-          <w:rFonts w:ascii="Times New Roman" w:hAnsi="Times New Roman" w:cs="Times New Roman"/>
-          <w:i/>
-          <w:iCs/>
-          <w:sz w:val="22"/>
-          <w:szCs w:val="22"/>
-          <w:lang w:val="nl-NL"/>
-        </w:rPr>
-        <w:t>13</w:t>
-      </w:r>
-      <w:r>
-        <w:rPr>
-          <w:rFonts w:ascii="Times New Roman" w:hAnsi="Times New Roman" w:cs="Times New Roman"/>
-          <w:sz w:val="22"/>
-          <w:szCs w:val="22"/>
-          <w:lang w:val="nl-NL"/>
-        </w:rPr>
-        <w:t>(14), 12737–12748. https://doi.org/10.1007/s13399-021-02218-x</w:t>
+        </w:rPr>
+        <w:t>92</w:t>
+      </w:r>
+      <w:r>
+        <w:rPr>
+          <w:rFonts w:ascii="Times New Roman" w:hAnsi="Times New Roman" w:cs="Times New Roman"/>
+          <w:sz w:val="22"/>
+        </w:rPr>
+        <w:t>, 331–336. https://doi.org/10.3303/CET2292056</w:t>
       </w:r>
     </w:p>
     <w:p>
       <w:pPr>
-        <w:pStyle w:val="Bibliography"/>
-        <w:rPr>
-          <w:rFonts w:ascii="Times New Roman" w:hAnsi="Times New Roman" w:cs="Times New Roman"/>
-          <w:sz w:val="22"/>
-          <w:szCs w:val="22"/>
+        <w:pStyle w:val="ae"/>
+        <w:rPr>
+          <w:rFonts w:ascii="Times New Roman" w:hAnsi="Times New Roman" w:cs="Times New Roman"/>
+          <w:sz w:val="22"/>
+          <w:szCs w:val="22"/>
+          <w:lang w:val="nl-NL"/>
         </w:rPr>
       </w:pPr>
-      <w:r>
-        <w:rPr>
-          <w:rFonts w:ascii="Times New Roman" w:hAnsi="Times New Roman" w:cs="Times New Roman"/>
-          <w:sz w:val="22"/>
-          <w:szCs w:val="22"/>
-          <w:lang w:val="nl-NL"/>
-        </w:rPr>
-        <w:t xml:space="preserve">Medina, S., </w:t>
-      </w:r>
-      <w:proofErr w:type="spellStart"/>
-      <w:r>
-        <w:rPr>
-          <w:rFonts w:ascii="Times New Roman" w:hAnsi="Times New Roman" w:cs="Times New Roman"/>
-          <w:sz w:val="22"/>
-          <w:szCs w:val="22"/>
-          <w:lang w:val="nl-NL"/>
-        </w:rPr>
-        <w:t>Stahl</w:t>
-      </w:r>
-      <w:proofErr w:type="spellEnd"/>
-      <w:r>
-        <w:rPr>
-          <w:rFonts w:ascii="Times New Roman" w:hAnsi="Times New Roman" w:cs="Times New Roman"/>
-          <w:sz w:val="22"/>
-          <w:szCs w:val="22"/>
-          <w:lang w:val="nl-NL"/>
-        </w:rPr>
-        <w:t xml:space="preserve">, U., </w:t>
-      </w:r>
-      <w:proofErr w:type="spellStart"/>
-      <w:r>
-        <w:rPr>
-          <w:rFonts w:ascii="Times New Roman" w:hAnsi="Times New Roman" w:cs="Times New Roman"/>
-          <w:sz w:val="22"/>
-          <w:szCs w:val="22"/>
-          <w:lang w:val="nl-NL"/>
-        </w:rPr>
-        <w:t>Ruiz</w:t>
-      </w:r>
-      <w:proofErr w:type="spellEnd"/>
-      <w:r>
-        <w:rPr>
-          <w:rFonts w:ascii="Times New Roman" w:hAnsi="Times New Roman" w:cs="Times New Roman"/>
-          <w:sz w:val="22"/>
-          <w:szCs w:val="22"/>
-          <w:lang w:val="nl-NL"/>
-        </w:rPr>
-        <w:t xml:space="preserve">, W., García, A. N., &amp; </w:t>
-      </w:r>
-      <w:proofErr w:type="spellStart"/>
-      <w:r>
-        <w:rPr>
-          <w:rFonts w:ascii="Times New Roman" w:hAnsi="Times New Roman" w:cs="Times New Roman"/>
-          <w:sz w:val="22"/>
-          <w:szCs w:val="22"/>
-          <w:lang w:val="nl-NL"/>
-        </w:rPr>
-        <w:t>Marcilla</w:t>
-      </w:r>
-      <w:proofErr w:type="spellEnd"/>
-      <w:r>
-        <w:rPr>
-          <w:rFonts w:ascii="Times New Roman" w:hAnsi="Times New Roman" w:cs="Times New Roman"/>
-          <w:sz w:val="22"/>
-          <w:szCs w:val="22"/>
-          <w:lang w:val="nl-NL"/>
-        </w:rPr>
-        <w:t xml:space="preserve">, A. (2025). </w:t>
-      </w:r>
-      <w:proofErr w:type="spellStart"/>
-      <w:r>
-        <w:rPr>
-          <w:rFonts w:ascii="Times New Roman" w:hAnsi="Times New Roman" w:cs="Times New Roman"/>
-          <w:sz w:val="22"/>
-          <w:szCs w:val="22"/>
-          <w:lang w:val="nl-NL"/>
-        </w:rPr>
-        <w:t>Characterization</w:t>
+      <w:proofErr w:type="spellStart"/>
+      <w:r>
+        <w:rPr>
+          <w:rFonts w:ascii="Times New Roman" w:hAnsi="Times New Roman" w:cs="Times New Roman"/>
+          <w:sz w:val="22"/>
+          <w:szCs w:val="22"/>
+          <w:lang w:val="nl-NL"/>
+        </w:rPr>
+        <w:t>Laougé</w:t>
+      </w:r>
+      <w:proofErr w:type="spellEnd"/>
+      <w:r>
+        <w:rPr>
+          <w:rFonts w:ascii="Times New Roman" w:hAnsi="Times New Roman" w:cs="Times New Roman"/>
+          <w:sz w:val="22"/>
+          <w:szCs w:val="22"/>
+          <w:lang w:val="nl-NL"/>
+        </w:rPr>
+        <w:t xml:space="preserve">, Z. B., </w:t>
+      </w:r>
+      <w:proofErr w:type="spellStart"/>
+      <w:r>
+        <w:rPr>
+          <w:rFonts w:ascii="Times New Roman" w:hAnsi="Times New Roman" w:cs="Times New Roman"/>
+          <w:sz w:val="22"/>
+          <w:szCs w:val="22"/>
+          <w:lang w:val="nl-NL"/>
+        </w:rPr>
+        <w:t>Karademir</w:t>
+      </w:r>
+      <w:proofErr w:type="spellEnd"/>
+      <w:r>
+        <w:rPr>
+          <w:rFonts w:ascii="Times New Roman" w:hAnsi="Times New Roman" w:cs="Times New Roman"/>
+          <w:sz w:val="22"/>
+          <w:szCs w:val="22"/>
+          <w:lang w:val="nl-NL"/>
+        </w:rPr>
+        <w:t xml:space="preserve">, F. S., &amp; </w:t>
+      </w:r>
+      <w:proofErr w:type="spellStart"/>
+      <w:r>
+        <w:rPr>
+          <w:rFonts w:ascii="Times New Roman" w:hAnsi="Times New Roman" w:cs="Times New Roman"/>
+          <w:sz w:val="22"/>
+          <w:szCs w:val="22"/>
+          <w:lang w:val="nl-NL"/>
+        </w:rPr>
+        <w:t>Merdun</w:t>
+      </w:r>
+      <w:proofErr w:type="spellEnd"/>
+      <w:r>
+        <w:rPr>
+          <w:rFonts w:ascii="Times New Roman" w:hAnsi="Times New Roman" w:cs="Times New Roman"/>
+          <w:sz w:val="22"/>
+          <w:szCs w:val="22"/>
+          <w:lang w:val="nl-NL"/>
+        </w:rPr>
+        <w:t xml:space="preserve">, H. (2023). </w:t>
+      </w:r>
+      <w:proofErr w:type="spellStart"/>
+      <w:r>
+        <w:rPr>
+          <w:rFonts w:ascii="Times New Roman" w:hAnsi="Times New Roman" w:cs="Times New Roman"/>
+          <w:sz w:val="22"/>
+          <w:szCs w:val="22"/>
+          <w:lang w:val="nl-NL"/>
+        </w:rPr>
+        <w:t>Production</w:t>
+      </w:r>
+      <w:proofErr w:type="spellEnd"/>
+      <w:r>
+        <w:rPr>
+          <w:rFonts w:ascii="Times New Roman" w:hAnsi="Times New Roman" w:cs="Times New Roman"/>
+          <w:sz w:val="22"/>
+          <w:szCs w:val="22"/>
+          <w:lang w:val="nl-NL"/>
+        </w:rPr>
+        <w:t xml:space="preserve"> </w:t>
+      </w:r>
+      <w:proofErr w:type="spellStart"/>
+      <w:r>
+        <w:rPr>
+          <w:rFonts w:ascii="Times New Roman" w:hAnsi="Times New Roman" w:cs="Times New Roman"/>
+          <w:sz w:val="22"/>
+          <w:szCs w:val="22"/>
+          <w:lang w:val="nl-NL"/>
+        </w:rPr>
+        <w:t>and</w:t>
+      </w:r>
+      <w:proofErr w:type="spellEnd"/>
+      <w:r>
+        <w:rPr>
+          <w:rFonts w:ascii="Times New Roman" w:hAnsi="Times New Roman" w:cs="Times New Roman"/>
+          <w:sz w:val="22"/>
+          <w:szCs w:val="22"/>
+          <w:lang w:val="nl-NL"/>
+        </w:rPr>
+        <w:t xml:space="preserve"> </w:t>
+      </w:r>
+      <w:proofErr w:type="spellStart"/>
+      <w:r>
+        <w:rPr>
+          <w:rFonts w:ascii="Times New Roman" w:hAnsi="Times New Roman" w:cs="Times New Roman"/>
+          <w:sz w:val="22"/>
+          <w:szCs w:val="22"/>
+          <w:lang w:val="nl-NL"/>
+        </w:rPr>
+        <w:t>characterization</w:t>
+      </w:r>
+      <w:proofErr w:type="spellEnd"/>
+      <w:r>
+        <w:rPr>
+          <w:rFonts w:ascii="Times New Roman" w:hAnsi="Times New Roman" w:cs="Times New Roman"/>
+          <w:sz w:val="22"/>
+          <w:szCs w:val="22"/>
+          <w:lang w:val="nl-NL"/>
+        </w:rPr>
+        <w:t xml:space="preserve"> of bio-</w:t>
+      </w:r>
+      <w:proofErr w:type="spellStart"/>
+      <w:r>
+        <w:rPr>
+          <w:rFonts w:ascii="Times New Roman" w:hAnsi="Times New Roman" w:cs="Times New Roman"/>
+          <w:sz w:val="22"/>
+          <w:szCs w:val="22"/>
+          <w:lang w:val="nl-NL"/>
+        </w:rPr>
+        <w:t>oil</w:t>
+      </w:r>
+      <w:proofErr w:type="spellEnd"/>
+      <w:r>
+        <w:rPr>
+          <w:rFonts w:ascii="Times New Roman" w:hAnsi="Times New Roman" w:cs="Times New Roman"/>
+          <w:sz w:val="22"/>
+          <w:szCs w:val="22"/>
+          <w:lang w:val="nl-NL"/>
+        </w:rPr>
+        <w:t xml:space="preserve"> </w:t>
+      </w:r>
+      <w:proofErr w:type="spellStart"/>
+      <w:r>
+        <w:rPr>
+          <w:rFonts w:ascii="Times New Roman" w:hAnsi="Times New Roman" w:cs="Times New Roman"/>
+          <w:sz w:val="22"/>
+          <w:szCs w:val="22"/>
+          <w:lang w:val="nl-NL"/>
+        </w:rPr>
+        <w:t>from</w:t>
+      </w:r>
+      <w:proofErr w:type="spellEnd"/>
+      <w:r>
+        <w:rPr>
+          <w:rFonts w:ascii="Times New Roman" w:hAnsi="Times New Roman" w:cs="Times New Roman"/>
+          <w:sz w:val="22"/>
+          <w:szCs w:val="22"/>
+          <w:lang w:val="nl-NL"/>
+        </w:rPr>
+        <w:t xml:space="preserve"> </w:t>
+      </w:r>
+      <w:proofErr w:type="spellStart"/>
+      <w:r>
+        <w:rPr>
+          <w:rFonts w:ascii="Times New Roman" w:hAnsi="Times New Roman" w:cs="Times New Roman"/>
+          <w:sz w:val="22"/>
+          <w:szCs w:val="22"/>
+          <w:lang w:val="nl-NL"/>
+        </w:rPr>
+        <w:t>catalytic</w:t>
+      </w:r>
+      <w:proofErr w:type="spellEnd"/>
+      <w:r>
+        <w:rPr>
+          <w:rFonts w:ascii="Times New Roman" w:hAnsi="Times New Roman" w:cs="Times New Roman"/>
+          <w:sz w:val="22"/>
+          <w:szCs w:val="22"/>
+          <w:lang w:val="nl-NL"/>
+        </w:rPr>
+        <w:t xml:space="preserve"> </w:t>
+      </w:r>
+      <w:proofErr w:type="spellStart"/>
+      <w:r>
+        <w:rPr>
+          <w:rFonts w:ascii="Times New Roman" w:hAnsi="Times New Roman" w:cs="Times New Roman"/>
+          <w:sz w:val="22"/>
+          <w:szCs w:val="22"/>
+          <w:lang w:val="nl-NL"/>
+        </w:rPr>
+        <w:t>fast</w:t>
+      </w:r>
+      <w:proofErr w:type="spellEnd"/>
+      <w:r>
+        <w:rPr>
+          <w:rFonts w:ascii="Times New Roman" w:hAnsi="Times New Roman" w:cs="Times New Roman"/>
+          <w:sz w:val="22"/>
+          <w:szCs w:val="22"/>
+          <w:lang w:val="nl-NL"/>
+        </w:rPr>
+        <w:t xml:space="preserve"> </w:t>
+      </w:r>
+      <w:proofErr w:type="spellStart"/>
+      <w:r>
+        <w:rPr>
+          <w:rFonts w:ascii="Times New Roman" w:hAnsi="Times New Roman" w:cs="Times New Roman"/>
+          <w:sz w:val="22"/>
+          <w:szCs w:val="22"/>
+          <w:lang w:val="nl-NL"/>
+        </w:rPr>
+        <w:t>pyrolysis</w:t>
       </w:r>
       <w:proofErr w:type="spellEnd"/>
       <w:r>
@@ -2245,7 +2222,7 @@
           <w:szCs w:val="22"/>
           <w:lang w:val="nl-NL"/>
         </w:rPr>
-        <w:t>Biochar</w:t>
+        <w:t>greenhouse</w:t>
       </w:r>
       <w:proofErr w:type="spellEnd"/>
       <w:r>
@@ -2265,7 +2242,7 @@
           <w:szCs w:val="22"/>
           <w:lang w:val="nl-NL"/>
         </w:rPr>
-        <w:t>Produced</w:t>
+        <w:t>vegetables</w:t>
       </w:r>
       <w:proofErr w:type="spellEnd"/>
       <w:r>
@@ -2285,35 +2262,17 @@
           <w:szCs w:val="22"/>
           <w:lang w:val="nl-NL"/>
         </w:rPr>
-        <w:t>from</w:t>
-      </w:r>
-      <w:proofErr w:type="spellEnd"/>
-      <w:r>
-        <w:rPr>
-          <w:rFonts w:ascii="Times New Roman" w:hAnsi="Times New Roman" w:cs="Times New Roman"/>
-          <w:sz w:val="22"/>
-          <w:szCs w:val="22"/>
-          <w:lang w:val="nl-NL"/>
-        </w:rPr>
-        <w:t xml:space="preserve"> Gr</w:t>
-      </w:r>
-      <w:proofErr w:type="spellStart"/>
-      <w:r>
-        <w:rPr>
-          <w:rFonts w:ascii="Times New Roman" w:hAnsi="Times New Roman" w:cs="Times New Roman"/>
-          <w:sz w:val="22"/>
-          <w:szCs w:val="22"/>
-        </w:rPr>
-        <w:t>eenhouse</w:t>
-      </w:r>
-      <w:proofErr w:type="spellEnd"/>
-      <w:r>
-        <w:rPr>
-          <w:rFonts w:ascii="Times New Roman" w:hAnsi="Times New Roman" w:cs="Times New Roman"/>
-          <w:sz w:val="22"/>
-          <w:szCs w:val="22"/>
-        </w:rPr>
-        <w:t xml:space="preserve"> Vegetable Waste and Its Application in Agricultural Soil Amendment. </w:t>
+        <w:t>wastes</w:t>
+      </w:r>
+      <w:proofErr w:type="spellEnd"/>
+      <w:r>
+        <w:rPr>
+          <w:rFonts w:ascii="Times New Roman" w:hAnsi="Times New Roman" w:cs="Times New Roman"/>
+          <w:sz w:val="22"/>
+          <w:szCs w:val="22"/>
+          <w:lang w:val="nl-NL"/>
+        </w:rPr>
+        <w:t xml:space="preserve">. </w:t>
       </w:r>
       <w:proofErr w:type="spellStart"/>
       <w:r>
@@ -2323,18 +2282,11 @@
           <w:iCs/>
           <w:sz w:val="22"/>
           <w:szCs w:val="22"/>
-        </w:rPr>
-        <w:t>AgriEngineering</w:t>
-      </w:r>
-      <w:proofErr w:type="spellEnd"/>
-      <w:r>
-        <w:rPr>
-          <w:rFonts w:ascii="Times New Roman" w:hAnsi="Times New Roman" w:cs="Times New Roman"/>
-          <w:sz w:val="22"/>
-          <w:szCs w:val="22"/>
-        </w:rPr>
-        <w:t xml:space="preserve">, </w:t>
-      </w:r>
+          <w:lang w:val="nl-NL"/>
+        </w:rPr>
+        <w:t>Biomass</w:t>
+      </w:r>
+      <w:proofErr w:type="spellEnd"/>
       <w:r>
         <w:rPr>
           <w:rFonts w:ascii="Times New Roman" w:hAnsi="Times New Roman" w:cs="Times New Roman"/>
@@ -2342,21 +2294,91 @@
           <w:iCs/>
           <w:sz w:val="22"/>
           <w:szCs w:val="22"/>
-        </w:rPr>
-        <w:t>7</w:t>
-      </w:r>
-      <w:r>
-        <w:rPr>
-          <w:rFonts w:ascii="Times New Roman" w:hAnsi="Times New Roman" w:cs="Times New Roman"/>
-          <w:sz w:val="22"/>
-          <w:szCs w:val="22"/>
-        </w:rPr>
-        <w:t>(10). https://doi.org/10.3390/agriengineering7100348</w:t>
-      </w:r>
+          <w:lang w:val="nl-NL"/>
+        </w:rPr>
+        <w:t xml:space="preserve"> Conversion </w:t>
+      </w:r>
+      <w:proofErr w:type="spellStart"/>
+      <w:r>
+        <w:rPr>
+          <w:rFonts w:ascii="Times New Roman" w:hAnsi="Times New Roman" w:cs="Times New Roman"/>
+          <w:i/>
+          <w:iCs/>
+          <w:sz w:val="22"/>
+          <w:szCs w:val="22"/>
+          <w:lang w:val="nl-NL"/>
+        </w:rPr>
+        <w:t>and</w:t>
+      </w:r>
+      <w:proofErr w:type="spellEnd"/>
+      <w:r>
+        <w:rPr>
+          <w:rFonts w:ascii="Times New Roman" w:hAnsi="Times New Roman" w:cs="Times New Roman"/>
+          <w:i/>
+          <w:iCs/>
+          <w:sz w:val="22"/>
+          <w:szCs w:val="22"/>
+          <w:lang w:val="nl-NL"/>
+        </w:rPr>
+        <w:t xml:space="preserve"> </w:t>
+      </w:r>
+      <w:proofErr w:type="spellStart"/>
+      <w:r>
+        <w:rPr>
+          <w:rFonts w:ascii="Times New Roman" w:hAnsi="Times New Roman" w:cs="Times New Roman"/>
+          <w:i/>
+          <w:iCs/>
+          <w:sz w:val="22"/>
+          <w:szCs w:val="22"/>
+          <w:lang w:val="nl-NL"/>
+        </w:rPr>
+        <w:t>Biorefinery</w:t>
+      </w:r>
+      <w:proofErr w:type="spellEnd"/>
+      <w:r>
+        <w:rPr>
+          <w:rFonts w:ascii="Times New Roman" w:hAnsi="Times New Roman" w:cs="Times New Roman"/>
+          <w:sz w:val="22"/>
+          <w:szCs w:val="22"/>
+          <w:lang w:val="nl-NL"/>
+        </w:rPr>
+        <w:t xml:space="preserve">, </w:t>
+      </w:r>
+      <w:r>
+        <w:rPr>
+          <w:rFonts w:ascii="Times New Roman" w:hAnsi="Times New Roman" w:cs="Times New Roman"/>
+          <w:i/>
+          <w:iCs/>
+          <w:sz w:val="22"/>
+          <w:szCs w:val="22"/>
+          <w:lang w:val="nl-NL"/>
+        </w:rPr>
+        <w:t>13</w:t>
+      </w:r>
+      <w:r>
+        <w:rPr>
+          <w:rFonts w:ascii="Times New Roman" w:hAnsi="Times New Roman" w:cs="Times New Roman"/>
+          <w:sz w:val="22"/>
+          <w:szCs w:val="22"/>
+          <w:lang w:val="nl-NL"/>
+        </w:rPr>
+        <w:t xml:space="preserve">(14), 12737–12748. </w:t>
+      </w:r>
+      <w:proofErr w:type="gramStart"/>
+      <w:r>
+        <w:rPr>
+          <w:rFonts w:ascii="Times New Roman" w:hAnsi="Times New Roman" w:cs="Times New Roman"/>
+          <w:sz w:val="22"/>
+          <w:szCs w:val="22"/>
+          <w:lang w:val="nl-NL"/>
+        </w:rPr>
+        <w:t>https://doi.org/10.1007/s13399-021-02218-x</w:t>
+      </w:r>
+      <w:proofErr w:type="gramEnd"/>
     </w:p>
     <w:p>
       <w:pPr>
-        <w:pStyle w:val="Bibliography"/>
+        <w:pStyle w:val="ae"/>
         <w:rPr>
           <w:rFonts w:ascii="Times New Roman" w:hAnsi="Times New Roman" w:cs="Times New Roman"/>
           <w:sz w:val="22"/>
@@ -2368,9 +2390,189 @@
           <w:rFonts w:ascii="Times New Roman" w:hAnsi="Times New Roman" w:cs="Times New Roman"/>
           <w:sz w:val="22"/>
           <w:szCs w:val="22"/>
-        </w:rPr>
-        <w:t xml:space="preserve">Pergola, M., Persiani, A., Palese, A. M., Di Meo, V., Pastore, V., D’Adamo, C., &amp; Celano, G. (2018). Composting: The way for a sustainable agriculture. </w:t>
-      </w:r>
+          <w:lang w:val="nl-NL"/>
+        </w:rPr>
+        <w:t xml:space="preserve">Medina, S., </w:t>
+      </w:r>
+      <w:proofErr w:type="spellStart"/>
+      <w:r>
+        <w:rPr>
+          <w:rFonts w:ascii="Times New Roman" w:hAnsi="Times New Roman" w:cs="Times New Roman"/>
+          <w:sz w:val="22"/>
+          <w:szCs w:val="22"/>
+          <w:lang w:val="nl-NL"/>
+        </w:rPr>
+        <w:t>Stahl</w:t>
+      </w:r>
+      <w:proofErr w:type="spellEnd"/>
+      <w:r>
+        <w:rPr>
+          <w:rFonts w:ascii="Times New Roman" w:hAnsi="Times New Roman" w:cs="Times New Roman"/>
+          <w:sz w:val="22"/>
+          <w:szCs w:val="22"/>
+          <w:lang w:val="nl-NL"/>
+        </w:rPr>
+        <w:t xml:space="preserve">, U., </w:t>
+      </w:r>
+      <w:proofErr w:type="spellStart"/>
+      <w:r>
+        <w:rPr>
+          <w:rFonts w:ascii="Times New Roman" w:hAnsi="Times New Roman" w:cs="Times New Roman"/>
+          <w:sz w:val="22"/>
+          <w:szCs w:val="22"/>
+          <w:lang w:val="nl-NL"/>
+        </w:rPr>
+        <w:t>Ruiz</w:t>
+      </w:r>
+      <w:proofErr w:type="spellEnd"/>
+      <w:r>
+        <w:rPr>
+          <w:rFonts w:ascii="Times New Roman" w:hAnsi="Times New Roman" w:cs="Times New Roman"/>
+          <w:sz w:val="22"/>
+          <w:szCs w:val="22"/>
+          <w:lang w:val="nl-NL"/>
+        </w:rPr>
+        <w:t xml:space="preserve">, W., </w:t>
+      </w:r>
+      <w:proofErr w:type="spellStart"/>
+      <w:r>
+        <w:rPr>
+          <w:rFonts w:ascii="Times New Roman" w:hAnsi="Times New Roman" w:cs="Times New Roman"/>
+          <w:sz w:val="22"/>
+          <w:szCs w:val="22"/>
+          <w:lang w:val="nl-NL"/>
+        </w:rPr>
+        <w:t>García</w:t>
+      </w:r>
+      <w:proofErr w:type="spellEnd"/>
+      <w:r>
+        <w:rPr>
+          <w:rFonts w:ascii="Times New Roman" w:hAnsi="Times New Roman" w:cs="Times New Roman"/>
+          <w:sz w:val="22"/>
+          <w:szCs w:val="22"/>
+          <w:lang w:val="nl-NL"/>
+        </w:rPr>
+        <w:t xml:space="preserve">, A. N., &amp; </w:t>
+      </w:r>
+      <w:proofErr w:type="spellStart"/>
+      <w:r>
+        <w:rPr>
+          <w:rFonts w:ascii="Times New Roman" w:hAnsi="Times New Roman" w:cs="Times New Roman"/>
+          <w:sz w:val="22"/>
+          <w:szCs w:val="22"/>
+          <w:lang w:val="nl-NL"/>
+        </w:rPr>
+        <w:t>Marcilla</w:t>
+      </w:r>
+      <w:proofErr w:type="spellEnd"/>
+      <w:r>
+        <w:rPr>
+          <w:rFonts w:ascii="Times New Roman" w:hAnsi="Times New Roman" w:cs="Times New Roman"/>
+          <w:sz w:val="22"/>
+          <w:szCs w:val="22"/>
+          <w:lang w:val="nl-NL"/>
+        </w:rPr>
+        <w:t xml:space="preserve">, A. (2025). </w:t>
+      </w:r>
+      <w:proofErr w:type="spellStart"/>
+      <w:r>
+        <w:rPr>
+          <w:rFonts w:ascii="Times New Roman" w:hAnsi="Times New Roman" w:cs="Times New Roman"/>
+          <w:sz w:val="22"/>
+          <w:szCs w:val="22"/>
+          <w:lang w:val="nl-NL"/>
+        </w:rPr>
+        <w:t>Characterization</w:t>
+      </w:r>
+      <w:proofErr w:type="spellEnd"/>
+      <w:r>
+        <w:rPr>
+          <w:rFonts w:ascii="Times New Roman" w:hAnsi="Times New Roman" w:cs="Times New Roman"/>
+          <w:sz w:val="22"/>
+          <w:szCs w:val="22"/>
+          <w:lang w:val="nl-NL"/>
+        </w:rPr>
+        <w:t xml:space="preserve"> of </w:t>
+      </w:r>
+      <w:proofErr w:type="spellStart"/>
+      <w:r>
+        <w:rPr>
+          <w:rFonts w:ascii="Times New Roman" w:hAnsi="Times New Roman" w:cs="Times New Roman"/>
+          <w:sz w:val="22"/>
+          <w:szCs w:val="22"/>
+          <w:lang w:val="nl-NL"/>
+        </w:rPr>
+        <w:t>Biochar</w:t>
+      </w:r>
+      <w:proofErr w:type="spellEnd"/>
+      <w:r>
+        <w:rPr>
+          <w:rFonts w:ascii="Times New Roman" w:hAnsi="Times New Roman" w:cs="Times New Roman"/>
+          <w:sz w:val="22"/>
+          <w:szCs w:val="22"/>
+          <w:lang w:val="nl-NL"/>
+        </w:rPr>
+        <w:t xml:space="preserve"> </w:t>
+      </w:r>
+      <w:proofErr w:type="spellStart"/>
+      <w:r>
+        <w:rPr>
+          <w:rFonts w:ascii="Times New Roman" w:hAnsi="Times New Roman" w:cs="Times New Roman"/>
+          <w:sz w:val="22"/>
+          <w:szCs w:val="22"/>
+          <w:lang w:val="nl-NL"/>
+        </w:rPr>
+        <w:t>Produced</w:t>
+      </w:r>
+      <w:proofErr w:type="spellEnd"/>
+      <w:r>
+        <w:rPr>
+          <w:rFonts w:ascii="Times New Roman" w:hAnsi="Times New Roman" w:cs="Times New Roman"/>
+          <w:sz w:val="22"/>
+          <w:szCs w:val="22"/>
+          <w:lang w:val="nl-NL"/>
+        </w:rPr>
+        <w:t xml:space="preserve"> </w:t>
+      </w:r>
+      <w:proofErr w:type="spellStart"/>
+      <w:r>
+        <w:rPr>
+          <w:rFonts w:ascii="Times New Roman" w:hAnsi="Times New Roman" w:cs="Times New Roman"/>
+          <w:sz w:val="22"/>
+          <w:szCs w:val="22"/>
+          <w:lang w:val="nl-NL"/>
+        </w:rPr>
+        <w:t>from</w:t>
+      </w:r>
+      <w:proofErr w:type="spellEnd"/>
+      <w:r>
+        <w:rPr>
+          <w:rFonts w:ascii="Times New Roman" w:hAnsi="Times New Roman" w:cs="Times New Roman"/>
+          <w:sz w:val="22"/>
+          <w:szCs w:val="22"/>
+          <w:lang w:val="nl-NL"/>
+        </w:rPr>
+        <w:t xml:space="preserve"> Gr</w:t>
+      </w:r>
+      <w:proofErr w:type="spellStart"/>
+      <w:r>
+        <w:rPr>
+          <w:rFonts w:ascii="Times New Roman" w:hAnsi="Times New Roman" w:cs="Times New Roman"/>
+          <w:sz w:val="22"/>
+          <w:szCs w:val="22"/>
+        </w:rPr>
+        <w:t>eenhouse</w:t>
+      </w:r>
+      <w:proofErr w:type="spellEnd"/>
+      <w:r>
+        <w:rPr>
+          <w:rFonts w:ascii="Times New Roman" w:hAnsi="Times New Roman" w:cs="Times New Roman"/>
+          <w:sz w:val="22"/>
+          <w:szCs w:val="22"/>
+        </w:rPr>
+        <w:t xml:space="preserve"> Vegetable Waste and Its Application in Agricultural Soil Amendment. </w:t>
+      </w:r>
+      <w:proofErr w:type="spellStart"/>
       <w:r>
         <w:rPr>
           <w:rFonts w:ascii="Times New Roman" w:hAnsi="Times New Roman" w:cs="Times New Roman"/>
@@ -2379,8 +2581,9 @@
           <w:sz w:val="22"/>
           <w:szCs w:val="22"/>
         </w:rPr>
-        <w:t>Applied Soil Ecology, HUMUSICA 3 - Reviews, Applications, Tools</w:t>
-      </w:r>
+        <w:t>AgriEngineering</w:t>
+      </w:r>
+      <w:proofErr w:type="spellEnd"/>
       <w:r>
         <w:rPr>
           <w:rFonts w:ascii="Times New Roman" w:hAnsi="Times New Roman" w:cs="Times New Roman"/>
@@ -2397,20 +2600,20 @@
           <w:sz w:val="22"/>
           <w:szCs w:val="22"/>
         </w:rPr>
-        <w:t>123</w:t>
-      </w:r>
-      <w:r>
-        <w:rPr>
-          <w:rFonts w:ascii="Times New Roman" w:hAnsi="Times New Roman" w:cs="Times New Roman"/>
-          <w:sz w:val="22"/>
-          <w:szCs w:val="22"/>
-        </w:rPr>
-        <w:t>, 744–750. https://doi.org/10.1016/j.apsoil.2017.10.016</w:t>
+        <w:t>7</w:t>
+      </w:r>
+      <w:r>
+        <w:rPr>
+          <w:rFonts w:ascii="Times New Roman" w:hAnsi="Times New Roman" w:cs="Times New Roman"/>
+          <w:sz w:val="22"/>
+          <w:szCs w:val="22"/>
+        </w:rPr>
+        <w:t>(10). https://doi.org/10.3390/agriengineering7100348</w:t>
       </w:r>
     </w:p>
     <w:p>
       <w:pPr>
-        <w:pStyle w:val="Bibliography"/>
+        <w:pStyle w:val="ae"/>
         <w:rPr>
           <w:rFonts w:ascii="Times New Roman" w:hAnsi="Times New Roman" w:cs="Times New Roman"/>
           <w:sz w:val="22"/>
@@ -2423,16 +2626,97 @@
           <w:sz w:val="22"/>
           <w:szCs w:val="22"/>
         </w:rPr>
-        <w:t xml:space="preserve">Pergola, M., Persiani, A., Pastore, V., Palese, A. M., D’Adamo, C., De Falco, E., &amp; Celano, G. (2020). Sustainability Assessment of the Green Compost Production Chain from </w:t>
-      </w:r>
-      <w:r>
-        <w:rPr>
-          <w:rFonts w:ascii="Times New Roman" w:hAnsi="Times New Roman" w:cs="Times New Roman"/>
-          <w:sz w:val="22"/>
-          <w:szCs w:val="22"/>
-        </w:rPr>
-        <w:lastRenderedPageBreak/>
-        <w:t xml:space="preserve">Agricultural Waste: A Case Study in Southern Italy. </w:t>
+        <w:t xml:space="preserve">Pergola, M., </w:t>
+      </w:r>
+      <w:proofErr w:type="spellStart"/>
+      <w:r>
+        <w:rPr>
+          <w:rFonts w:ascii="Times New Roman" w:hAnsi="Times New Roman" w:cs="Times New Roman"/>
+          <w:sz w:val="22"/>
+          <w:szCs w:val="22"/>
+        </w:rPr>
+        <w:t>Persiani</w:t>
+      </w:r>
+      <w:proofErr w:type="spellEnd"/>
+      <w:r>
+        <w:rPr>
+          <w:rFonts w:ascii="Times New Roman" w:hAnsi="Times New Roman" w:cs="Times New Roman"/>
+          <w:sz w:val="22"/>
+          <w:szCs w:val="22"/>
+        </w:rPr>
+        <w:t xml:space="preserve">, A., </w:t>
+      </w:r>
+      <w:proofErr w:type="spellStart"/>
+      <w:r>
+        <w:rPr>
+          <w:rFonts w:ascii="Times New Roman" w:hAnsi="Times New Roman" w:cs="Times New Roman"/>
+          <w:sz w:val="22"/>
+          <w:szCs w:val="22"/>
+        </w:rPr>
+        <w:t>Palese</w:t>
+      </w:r>
+      <w:proofErr w:type="spellEnd"/>
+      <w:r>
+        <w:rPr>
+          <w:rFonts w:ascii="Times New Roman" w:hAnsi="Times New Roman" w:cs="Times New Roman"/>
+          <w:sz w:val="22"/>
+          <w:szCs w:val="22"/>
+        </w:rPr>
+        <w:t xml:space="preserve">, A. M., Di </w:t>
+      </w:r>
+      <w:proofErr w:type="spellStart"/>
+      <w:r>
+        <w:rPr>
+          <w:rFonts w:ascii="Times New Roman" w:hAnsi="Times New Roman" w:cs="Times New Roman"/>
+          <w:sz w:val="22"/>
+          <w:szCs w:val="22"/>
+        </w:rPr>
+        <w:t>Meo</w:t>
+      </w:r>
+      <w:proofErr w:type="spellEnd"/>
+      <w:r>
+        <w:rPr>
+          <w:rFonts w:ascii="Times New Roman" w:hAnsi="Times New Roman" w:cs="Times New Roman"/>
+          <w:sz w:val="22"/>
+          <w:szCs w:val="22"/>
+        </w:rPr>
+        <w:t xml:space="preserve">, V., Pastore, V., </w:t>
+      </w:r>
+      <w:proofErr w:type="spellStart"/>
+      <w:r>
+        <w:rPr>
+          <w:rFonts w:ascii="Times New Roman" w:hAnsi="Times New Roman" w:cs="Times New Roman"/>
+          <w:sz w:val="22"/>
+          <w:szCs w:val="22"/>
+        </w:rPr>
+        <w:t>D’Adamo</w:t>
+      </w:r>
+      <w:proofErr w:type="spellEnd"/>
+      <w:r>
+        <w:rPr>
+          <w:rFonts w:ascii="Times New Roman" w:hAnsi="Times New Roman" w:cs="Times New Roman"/>
+          <w:sz w:val="22"/>
+          <w:szCs w:val="22"/>
+        </w:rPr>
+        <w:t xml:space="preserve">, C., &amp; </w:t>
+      </w:r>
+      <w:proofErr w:type="spellStart"/>
+      <w:r>
+        <w:rPr>
+          <w:rFonts w:ascii="Times New Roman" w:hAnsi="Times New Roman" w:cs="Times New Roman"/>
+          <w:sz w:val="22"/>
+          <w:szCs w:val="22"/>
+        </w:rPr>
+        <w:t>Celano</w:t>
+      </w:r>
+      <w:proofErr w:type="spellEnd"/>
+      <w:r>
+        <w:rPr>
+          <w:rFonts w:ascii="Times New Roman" w:hAnsi="Times New Roman" w:cs="Times New Roman"/>
+          <w:sz w:val="22"/>
+          <w:szCs w:val="22"/>
+        </w:rPr>
+        <w:t xml:space="preserve">, G. (2018). Composting: The way for a sustainable agriculture. </w:t>
       </w:r>
       <w:r>
         <w:rPr>
@@ -2442,7 +2726,7 @@
           <w:sz w:val="22"/>
           <w:szCs w:val="22"/>
         </w:rPr>
-        <w:t>Agronomy</w:t>
+        <w:t>Applied Soil Ecology, HUMUSICA 3 - Reviews, Applications, Tools</w:t>
       </w:r>
       <w:r>
         <w:rPr>
@@ -2460,20 +2744,20 @@
           <w:sz w:val="22"/>
           <w:szCs w:val="22"/>
         </w:rPr>
-        <w:t>10</w:t>
-      </w:r>
-      <w:r>
-        <w:rPr>
-          <w:rFonts w:ascii="Times New Roman" w:hAnsi="Times New Roman" w:cs="Times New Roman"/>
-          <w:sz w:val="22"/>
-          <w:szCs w:val="22"/>
-        </w:rPr>
-        <w:t>(2), 230. https://doi.org/10.3390/agronomy10020230</w:t>
+        <w:t>123</w:t>
+      </w:r>
+      <w:r>
+        <w:rPr>
+          <w:rFonts w:ascii="Times New Roman" w:hAnsi="Times New Roman" w:cs="Times New Roman"/>
+          <w:sz w:val="22"/>
+          <w:szCs w:val="22"/>
+        </w:rPr>
+        <w:t>, 744–750. https://doi.org/10.1016/j.apsoil.2017.10.016</w:t>
       </w:r>
     </w:p>
     <w:p>
       <w:pPr>
-        <w:pStyle w:val="Bibliography"/>
+        <w:pStyle w:val="ae"/>
         <w:rPr>
           <w:rFonts w:ascii="Times New Roman" w:hAnsi="Times New Roman" w:cs="Times New Roman"/>
           <w:sz w:val="22"/>
@@ -2486,25 +2770,79 @@
           <w:sz w:val="22"/>
           <w:szCs w:val="22"/>
         </w:rPr>
-        <w:t xml:space="preserve">Pradhan, S., Abdelaal, A. H., Mroue, K., Al-Ansari, T., Mackey, H. R., &amp; McKay, G. (2020). Biochar from vegetable wastes: </w:t>
-      </w:r>
-      <w:proofErr w:type="spellStart"/>
-      <w:r>
-        <w:rPr>
-          <w:rFonts w:ascii="Times New Roman" w:hAnsi="Times New Roman" w:cs="Times New Roman"/>
-          <w:sz w:val="22"/>
-          <w:szCs w:val="22"/>
-        </w:rPr>
-        <w:t>Agro</w:t>
-      </w:r>
-      <w:proofErr w:type="spellEnd"/>
-      <w:r>
-        <w:rPr>
-          <w:rFonts w:ascii="Times New Roman" w:hAnsi="Times New Roman" w:cs="Times New Roman"/>
-          <w:sz w:val="22"/>
-          <w:szCs w:val="22"/>
-        </w:rPr>
-        <w:t xml:space="preserve">-environmental characterization. </w:t>
+        <w:t xml:space="preserve">Pergola, M., </w:t>
+      </w:r>
+      <w:proofErr w:type="spellStart"/>
+      <w:r>
+        <w:rPr>
+          <w:rFonts w:ascii="Times New Roman" w:hAnsi="Times New Roman" w:cs="Times New Roman"/>
+          <w:sz w:val="22"/>
+          <w:szCs w:val="22"/>
+        </w:rPr>
+        <w:t>Persiani</w:t>
+      </w:r>
+      <w:proofErr w:type="spellEnd"/>
+      <w:r>
+        <w:rPr>
+          <w:rFonts w:ascii="Times New Roman" w:hAnsi="Times New Roman" w:cs="Times New Roman"/>
+          <w:sz w:val="22"/>
+          <w:szCs w:val="22"/>
+        </w:rPr>
+        <w:t xml:space="preserve">, A., Pastore, V., </w:t>
+      </w:r>
+      <w:proofErr w:type="spellStart"/>
+      <w:r>
+        <w:rPr>
+          <w:rFonts w:ascii="Times New Roman" w:hAnsi="Times New Roman" w:cs="Times New Roman"/>
+          <w:sz w:val="22"/>
+          <w:szCs w:val="22"/>
+        </w:rPr>
+        <w:t>Palese</w:t>
+      </w:r>
+      <w:proofErr w:type="spellEnd"/>
+      <w:r>
+        <w:rPr>
+          <w:rFonts w:ascii="Times New Roman" w:hAnsi="Times New Roman" w:cs="Times New Roman"/>
+          <w:sz w:val="22"/>
+          <w:szCs w:val="22"/>
+        </w:rPr>
+        <w:t xml:space="preserve">, A. M., </w:t>
+      </w:r>
+      <w:proofErr w:type="spellStart"/>
+      <w:r>
+        <w:rPr>
+          <w:rFonts w:ascii="Times New Roman" w:hAnsi="Times New Roman" w:cs="Times New Roman"/>
+          <w:sz w:val="22"/>
+          <w:szCs w:val="22"/>
+        </w:rPr>
+        <w:t>D’Adamo</w:t>
+      </w:r>
+      <w:proofErr w:type="spellEnd"/>
+      <w:r>
+        <w:rPr>
+          <w:rFonts w:ascii="Times New Roman" w:hAnsi="Times New Roman" w:cs="Times New Roman"/>
+          <w:sz w:val="22"/>
+          <w:szCs w:val="22"/>
+        </w:rPr>
+        <w:t xml:space="preserve">, C., De Falco, E., &amp; </w:t>
+      </w:r>
+      <w:proofErr w:type="spellStart"/>
+      <w:r>
+        <w:rPr>
+          <w:rFonts w:ascii="Times New Roman" w:hAnsi="Times New Roman" w:cs="Times New Roman"/>
+          <w:sz w:val="22"/>
+          <w:szCs w:val="22"/>
+        </w:rPr>
+        <w:t>Celano</w:t>
+      </w:r>
+      <w:proofErr w:type="spellEnd"/>
+      <w:r>
+        <w:rPr>
+          <w:rFonts w:ascii="Times New Roman" w:hAnsi="Times New Roman" w:cs="Times New Roman"/>
+          <w:sz w:val="22"/>
+          <w:szCs w:val="22"/>
+        </w:rPr>
+        <w:t xml:space="preserve">, G. (2020). Sustainability Assessment of the Green Compost Production Chain from Agricultural Waste: A Case Study in Southern Italy. </w:t>
       </w:r>
       <w:r>
         <w:rPr>
@@ -2514,7 +2852,7 @@
           <w:sz w:val="22"/>
           <w:szCs w:val="22"/>
         </w:rPr>
-        <w:t>Biochar</w:t>
+        <w:t>Agronomy</w:t>
       </w:r>
       <w:r>
         <w:rPr>
@@ -2532,93 +2870,88 @@
           <w:sz w:val="22"/>
           <w:szCs w:val="22"/>
         </w:rPr>
-        <w:t>2</w:t>
-      </w:r>
-      <w:r>
-        <w:rPr>
-          <w:rFonts w:ascii="Times New Roman" w:hAnsi="Times New Roman" w:cs="Times New Roman"/>
-          <w:sz w:val="22"/>
-          <w:szCs w:val="22"/>
-        </w:rPr>
-        <w:t>(4), 439–453. https://doi.org/10.1007/s42773-020-00069-9</w:t>
+        <w:t>10</w:t>
+      </w:r>
+      <w:r>
+        <w:rPr>
+          <w:rFonts w:ascii="Times New Roman" w:hAnsi="Times New Roman" w:cs="Times New Roman"/>
+          <w:sz w:val="22"/>
+          <w:szCs w:val="22"/>
+        </w:rPr>
+        <w:t>(2), 230. https://doi.org/10.3390/agronomy10020230</w:t>
       </w:r>
     </w:p>
     <w:p>
       <w:pPr>
-        <w:pStyle w:val="Bibliography"/>
+        <w:pStyle w:val="ae"/>
         <w:rPr>
           <w:rFonts w:ascii="Times New Roman" w:hAnsi="Times New Roman" w:cs="Times New Roman"/>
           <w:sz w:val="22"/>
           <w:szCs w:val="22"/>
         </w:rPr>
       </w:pPr>
-      <w:proofErr w:type="spellStart"/>
-      <w:r>
-        <w:rPr>
-          <w:rFonts w:ascii="Times New Roman" w:hAnsi="Times New Roman" w:cs="Times New Roman"/>
-          <w:sz w:val="22"/>
-          <w:szCs w:val="22"/>
-          <w:lang w:val="nl-NL"/>
-        </w:rPr>
-        <w:t>Yavuz</w:t>
-      </w:r>
-      <w:proofErr w:type="spellEnd"/>
-      <w:r>
-        <w:rPr>
-          <w:rFonts w:ascii="Times New Roman" w:hAnsi="Times New Roman" w:cs="Times New Roman"/>
-          <w:sz w:val="22"/>
-          <w:szCs w:val="22"/>
-          <w:lang w:val="nl-NL"/>
-        </w:rPr>
-        <w:t xml:space="preserve">, B., &amp; </w:t>
-      </w:r>
-      <w:proofErr w:type="spellStart"/>
-      <w:r>
-        <w:rPr>
-          <w:rFonts w:ascii="Times New Roman" w:hAnsi="Times New Roman" w:cs="Times New Roman"/>
-          <w:sz w:val="22"/>
-          <w:szCs w:val="22"/>
-          <w:lang w:val="nl-NL"/>
-        </w:rPr>
-        <w:t>Aksoğan</w:t>
-      </w:r>
-      <w:proofErr w:type="spellEnd"/>
-      <w:r>
-        <w:rPr>
-          <w:rFonts w:ascii="Times New Roman" w:hAnsi="Times New Roman" w:cs="Times New Roman"/>
-          <w:sz w:val="22"/>
-          <w:szCs w:val="22"/>
-          <w:lang w:val="nl-NL"/>
-        </w:rPr>
-        <w:t xml:space="preserve"> </w:t>
-      </w:r>
-      <w:proofErr w:type="spellStart"/>
-      <w:r>
-        <w:rPr>
-          <w:rFonts w:ascii="Times New Roman" w:hAnsi="Times New Roman" w:cs="Times New Roman"/>
-          <w:sz w:val="22"/>
-          <w:szCs w:val="22"/>
-          <w:lang w:val="nl-NL"/>
-        </w:rPr>
-        <w:t>Korkmaz</w:t>
-      </w:r>
-      <w:proofErr w:type="spellEnd"/>
-      <w:r>
-        <w:rPr>
-          <w:rFonts w:ascii="Times New Roman" w:hAnsi="Times New Roman" w:cs="Times New Roman"/>
-          <w:sz w:val="22"/>
-          <w:szCs w:val="22"/>
-          <w:lang w:val="nl-NL"/>
-        </w:rPr>
-        <w:t xml:space="preserve">, A. (2025). </w:t>
-      </w:r>
-      <w:r>
-        <w:rPr>
-          <w:rFonts w:ascii="Times New Roman" w:hAnsi="Times New Roman" w:cs="Times New Roman"/>
-          <w:sz w:val="22"/>
-          <w:szCs w:val="22"/>
-        </w:rPr>
-        <w:t xml:space="preserve">The viability of biochar as an alternative low-emission fuel from waste biomass carbonization. </w:t>
+      <w:r>
+        <w:rPr>
+          <w:rFonts w:ascii="Times New Roman" w:hAnsi="Times New Roman" w:cs="Times New Roman"/>
+          <w:sz w:val="22"/>
+          <w:szCs w:val="22"/>
+        </w:rPr>
+        <w:lastRenderedPageBreak/>
+        <w:t xml:space="preserve">Pradhan, S., </w:t>
+      </w:r>
+      <w:proofErr w:type="spellStart"/>
+      <w:r>
+        <w:rPr>
+          <w:rFonts w:ascii="Times New Roman" w:hAnsi="Times New Roman" w:cs="Times New Roman"/>
+          <w:sz w:val="22"/>
+          <w:szCs w:val="22"/>
+        </w:rPr>
+        <w:t>Abdelaal</w:t>
+      </w:r>
+      <w:proofErr w:type="spellEnd"/>
+      <w:r>
+        <w:rPr>
+          <w:rFonts w:ascii="Times New Roman" w:hAnsi="Times New Roman" w:cs="Times New Roman"/>
+          <w:sz w:val="22"/>
+          <w:szCs w:val="22"/>
+        </w:rPr>
+        <w:t xml:space="preserve">, A. H., </w:t>
+      </w:r>
+      <w:proofErr w:type="spellStart"/>
+      <w:r>
+        <w:rPr>
+          <w:rFonts w:ascii="Times New Roman" w:hAnsi="Times New Roman" w:cs="Times New Roman"/>
+          <w:sz w:val="22"/>
+          <w:szCs w:val="22"/>
+        </w:rPr>
+        <w:t>Mroue</w:t>
+      </w:r>
+      <w:proofErr w:type="spellEnd"/>
+      <w:r>
+        <w:rPr>
+          <w:rFonts w:ascii="Times New Roman" w:hAnsi="Times New Roman" w:cs="Times New Roman"/>
+          <w:sz w:val="22"/>
+          <w:szCs w:val="22"/>
+        </w:rPr>
+        <w:t xml:space="preserve">, K., Al-Ansari, T., Mackey, H. R., &amp; McKay, G. (2020). Biochar from vegetable wastes: </w:t>
+      </w:r>
+      <w:proofErr w:type="spellStart"/>
+      <w:r>
+        <w:rPr>
+          <w:rFonts w:ascii="Times New Roman" w:hAnsi="Times New Roman" w:cs="Times New Roman"/>
+          <w:sz w:val="22"/>
+          <w:szCs w:val="22"/>
+        </w:rPr>
+        <w:t>Agro</w:t>
+      </w:r>
+      <w:proofErr w:type="spellEnd"/>
+      <w:r>
+        <w:rPr>
+          <w:rFonts w:ascii="Times New Roman" w:hAnsi="Times New Roman" w:cs="Times New Roman"/>
+          <w:sz w:val="22"/>
+          <w:szCs w:val="22"/>
+        </w:rPr>
+        <w:t xml:space="preserve">-environmental characterization. </w:t>
       </w:r>
       <w:r>
         <w:rPr>
@@ -2628,7 +2961,7 @@
           <w:sz w:val="22"/>
           <w:szCs w:val="22"/>
         </w:rPr>
-        <w:t>Biofuels</w:t>
+        <w:t>Biochar</w:t>
       </w:r>
       <w:r>
         <w:rPr>
@@ -2646,30 +2979,229 @@
           <w:sz w:val="22"/>
           <w:szCs w:val="22"/>
         </w:rPr>
-        <w:t>0</w:t>
-      </w:r>
-      <w:r>
-        <w:rPr>
-          <w:rFonts w:ascii="Times New Roman" w:hAnsi="Times New Roman" w:cs="Times New Roman"/>
-          <w:sz w:val="22"/>
-          <w:szCs w:val="22"/>
-        </w:rPr>
-        <w:t>(0), 1–17. https://doi.org/10.1080/17597269.2025.2598946</w:t>
+        <w:t>2</w:t>
+      </w:r>
+      <w:r>
+        <w:rPr>
+          <w:rFonts w:ascii="Times New Roman" w:hAnsi="Times New Roman" w:cs="Times New Roman"/>
+          <w:sz w:val="22"/>
+          <w:szCs w:val="22"/>
+        </w:rPr>
+        <w:t>(4), 439–453. https://doi.org/10.1007/s42773-020-00069-9</w:t>
       </w:r>
     </w:p>
     <w:p>
       <w:pPr>
-        <w:rPr>
-          <w:rFonts w:ascii="Times New Roman" w:hAnsi="Times New Roman" w:cs="Times New Roman"/>
-          <w:sz w:val="22"/>
-          <w:szCs w:val="22"/>
+        <w:pStyle w:val="ae"/>
+        <w:rPr>
+          <w:rFonts w:ascii="Times New Roman" w:hAnsi="Times New Roman" w:cs="Times New Roman"/>
+          <w:sz w:val="22"/>
         </w:rPr>
       </w:pPr>
       <w:r>
         <w:rPr>
-          <w:rFonts w:ascii="Times New Roman" w:hAnsi="Times New Roman" w:cs="Times New Roman"/>
-          <w:sz w:val="22"/>
-          <w:szCs w:val="22"/>
+          <w:sz w:val="22"/>
+          <w:szCs w:val="22"/>
+        </w:rPr>
+        <w:fldChar w:fldCharType="begin"/>
+      </w:r>
+      <w:r>
+        <w:rPr>
+          <w:sz w:val="22"/>
+          <w:szCs w:val="22"/>
+          <w:lang w:val="nl-NL"/>
+        </w:rPr>
+        <w:instrText xml:space="preserve"> ADDIN ZOTERO_BIBL {"uncited":[],"omitted":[],"custom":[]} CSL_BIBLIOGRAPHY </w:instrText>
+      </w:r>
+      <w:r>
+        <w:rPr>
+          <w:sz w:val="22"/>
+          <w:szCs w:val="22"/>
+        </w:rPr>
+        <w:fldChar w:fldCharType="separate"/>
+      </w:r>
+      <w:r>
+        <w:rPr>
+          <w:rFonts w:ascii="Times New Roman" w:hAnsi="Times New Roman" w:cs="Times New Roman"/>
+          <w:sz w:val="22"/>
+        </w:rPr>
+        <w:t xml:space="preserve">Stella Mary, G., Sugumaran, P., Niveditha, S., Ramalakshmi, B., Ravichandran, P., &amp; Seshadri, S. (2016). Production, characterization and evaluation of biochar from pod (Pisum sativum), leaf (Brassica oleracea) and peel (Citrus sinensis) wastes. </w:t>
+      </w:r>
+      <w:r>
+        <w:rPr>
+          <w:rFonts w:ascii="Times New Roman" w:hAnsi="Times New Roman" w:cs="Times New Roman"/>
+          <w:i/>
+          <w:iCs/>
+          <w:sz w:val="22"/>
+        </w:rPr>
+        <w:t>International Journal of Recycling of Organic Waste in Agriculture</w:t>
+      </w:r>
+      <w:r>
+        <w:rPr>
+          <w:rFonts w:ascii="Times New Roman" w:hAnsi="Times New Roman" w:cs="Times New Roman"/>
+          <w:sz w:val="22"/>
+        </w:rPr>
+        <w:t xml:space="preserve">, </w:t>
+      </w:r>
+      <w:r>
+        <w:rPr>
+          <w:rFonts w:ascii="Times New Roman" w:hAnsi="Times New Roman" w:cs="Times New Roman"/>
+          <w:i/>
+          <w:iCs/>
+          <w:sz w:val="22"/>
+        </w:rPr>
+        <w:t>5</w:t>
+      </w:r>
+      <w:r>
+        <w:rPr>
+          <w:rFonts w:ascii="Times New Roman" w:hAnsi="Times New Roman" w:cs="Times New Roman"/>
+          <w:sz w:val="22"/>
+        </w:rPr>
+        <w:t>(1), 43–53. https://doi.org/10.1007/s40093-016-0116-8</w:t>
+      </w:r>
+    </w:p>
+    <w:p>
+      <w:r>
+        <w:rPr>
+          <w:rFonts w:ascii="Times New Roman" w:hAnsi="Times New Roman" w:cs="Times New Roman"/>
+          <w:sz w:val="22"/>
+          <w:szCs w:val="22"/>
+        </w:rPr>
+        <w:fldChar w:fldCharType="end"/>
+      </w:r>
+    </w:p>
+    <w:p>
+      <w:pPr>
+        <w:pStyle w:val="ae"/>
+        <w:rPr>
+          <w:rFonts w:ascii="Times New Roman" w:hAnsi="Times New Roman" w:cs="Times New Roman"/>
+          <w:sz w:val="22"/>
+          <w:szCs w:val="22"/>
+        </w:rPr>
+      </w:pPr>
+      <w:proofErr w:type="spellStart"/>
+      <w:r>
+        <w:rPr>
+          <w:rFonts w:ascii="Times New Roman" w:hAnsi="Times New Roman" w:cs="Times New Roman"/>
+          <w:sz w:val="22"/>
+          <w:szCs w:val="22"/>
+          <w:lang w:val="nl-NL"/>
+        </w:rPr>
+        <w:t>Yavuz</w:t>
+      </w:r>
+      <w:proofErr w:type="spellEnd"/>
+      <w:r>
+        <w:rPr>
+          <w:rFonts w:ascii="Times New Roman" w:hAnsi="Times New Roman" w:cs="Times New Roman"/>
+          <w:sz w:val="22"/>
+          <w:szCs w:val="22"/>
+          <w:lang w:val="nl-NL"/>
+        </w:rPr>
+        <w:t xml:space="preserve">, B., &amp; </w:t>
+      </w:r>
+      <w:proofErr w:type="spellStart"/>
+      <w:r>
+        <w:rPr>
+          <w:rFonts w:ascii="Times New Roman" w:hAnsi="Times New Roman" w:cs="Times New Roman"/>
+          <w:sz w:val="22"/>
+          <w:szCs w:val="22"/>
+          <w:lang w:val="nl-NL"/>
+        </w:rPr>
+        <w:t>Aksoğan</w:t>
+      </w:r>
+      <w:proofErr w:type="spellEnd"/>
+      <w:r>
+        <w:rPr>
+          <w:rFonts w:ascii="Times New Roman" w:hAnsi="Times New Roman" w:cs="Times New Roman"/>
+          <w:sz w:val="22"/>
+          <w:szCs w:val="22"/>
+          <w:lang w:val="nl-NL"/>
+        </w:rPr>
+        <w:t xml:space="preserve"> </w:t>
+      </w:r>
+      <w:proofErr w:type="spellStart"/>
+      <w:r>
+        <w:rPr>
+          <w:rFonts w:ascii="Times New Roman" w:hAnsi="Times New Roman" w:cs="Times New Roman"/>
+          <w:sz w:val="22"/>
+          <w:szCs w:val="22"/>
+          <w:lang w:val="nl-NL"/>
+        </w:rPr>
+        <w:t>Korkmaz</w:t>
+      </w:r>
+      <w:proofErr w:type="spellEnd"/>
+      <w:r>
+        <w:rPr>
+          <w:rFonts w:ascii="Times New Roman" w:hAnsi="Times New Roman" w:cs="Times New Roman"/>
+          <w:sz w:val="22"/>
+          <w:szCs w:val="22"/>
+          <w:lang w:val="nl-NL"/>
+        </w:rPr>
+        <w:t xml:space="preserve">, A. (2025). </w:t>
+      </w:r>
+      <w:r>
+        <w:rPr>
+          <w:rFonts w:ascii="Times New Roman" w:hAnsi="Times New Roman" w:cs="Times New Roman"/>
+          <w:sz w:val="22"/>
+          <w:szCs w:val="22"/>
+        </w:rPr>
+        <w:t xml:space="preserve">The viability of biochar as an alternative low-emission fuel from waste biomass carbonization. </w:t>
+      </w:r>
+      <w:r>
+        <w:rPr>
+          <w:rFonts w:ascii="Times New Roman" w:hAnsi="Times New Roman" w:cs="Times New Roman"/>
+          <w:i/>
+          <w:iCs/>
+          <w:sz w:val="22"/>
+          <w:szCs w:val="22"/>
+        </w:rPr>
+        <w:t>Biofuels</w:t>
+      </w:r>
+      <w:r>
+        <w:rPr>
+          <w:rFonts w:ascii="Times New Roman" w:hAnsi="Times New Roman" w:cs="Times New Roman"/>
+          <w:sz w:val="22"/>
+          <w:szCs w:val="22"/>
+        </w:rPr>
+        <w:t xml:space="preserve">, </w:t>
+      </w:r>
+      <w:r>
+        <w:rPr>
+          <w:rFonts w:ascii="Times New Roman" w:hAnsi="Times New Roman" w:cs="Times New Roman"/>
+          <w:i/>
+          <w:iCs/>
+          <w:sz w:val="22"/>
+          <w:szCs w:val="22"/>
+        </w:rPr>
+        <w:t>0</w:t>
+      </w:r>
+      <w:r>
+        <w:rPr>
+          <w:rFonts w:ascii="Times New Roman" w:hAnsi="Times New Roman" w:cs="Times New Roman"/>
+          <w:sz w:val="22"/>
+          <w:szCs w:val="22"/>
+        </w:rPr>
+        <w:t>(0), 1–17. https://doi.org/10.1080/17597269.2025.2598946</w:t>
+      </w:r>
+    </w:p>
+    <w:p>
+      <w:pPr>
+        <w:rPr>
+          <w:rFonts w:ascii="Times New Roman" w:hAnsi="Times New Roman" w:cs="Times New Roman" w:hint="eastAsia"/>
+          <w:b/>
+          <w:bCs/>
+          <w:sz w:val="22"/>
+          <w:szCs w:val="22"/>
+          <w:lang w:val="nl-NL"/>
+        </w:rPr>
+      </w:pPr>
+      <w:r>
+        <w:rPr>
+          <w:rFonts w:ascii="Times New Roman" w:hAnsi="Times New Roman" w:cs="Times New Roman"/>
+          <w:kern w:val="0"/>
+          <w:sz w:val="22"/>
+          <w:szCs w:val="22"/>
+          <w14:ligatures w14:val="none"/>
         </w:rPr>
         <w:fldChar w:fldCharType="end"/>
       </w:r>
@@ -2685,7 +3217,7 @@
 </file>
 
 <file path=word/numbering.xml><?xml version="1.0" encoding="utf-8"?>
-<w:numbering xmlns:wpc="http://schemas.microsoft.com/office/word/2010/wordprocessingCanvas" xmlns:cx="http://schemas.microsoft.com/office/drawing/2014/chartex" xmlns:cx1="http://schemas.microsoft.com/office/drawing/2015/9/8/chartex" xmlns:cx2="http://schemas.microsoft.com/office/drawing/2015/10/21/chartex" xmlns:cx3="http://schemas.microsoft.com/office/drawing/2016/5/9/chartex" xmlns:cx4="http://schemas.microsoft.com/office/drawing/2016/5/10/chartex" xmlns:cx5="http://schemas.microsoft.com/office/drawing/2016/5/11/chartex" xmlns:cx6="http://schemas.microsoft.com/office/drawing/2016/5/12/chartex" xmlns:cx7="http://schemas.microsoft.com/office/drawing/2016/5/13/chartex" xmlns:cx8="http://schemas.microsoft.com/office/drawing/2016/5/14/chartex" xmlns:mc="http://schemas.openxmlformats.org/markup-compatibility/2006" xmlns:aink="http://schemas.microsoft.com/office/drawing/2016/ink" xmlns:am3d="http://schemas.microsoft.com/office/drawing/2017/model3d" xmlns:o="urn:schemas-microsoft-com:office:office" xmlns:oel="http://schemas.microsoft.com/office/2019/extlst" xmlns:r="http://schemas.openxmlformats.org/officeDocument/2006/relationships" xmlns:m="http://schemas.openxmlformats.org/officeDocument/2006/math" xmlns:v="urn:schemas-microsoft-com:vml" xmlns:wp14="http://schemas.microsoft.com/office/word/2010/wordprocessingDrawing" xmlns:wp="http://schemas.openxmlformats.org/drawingml/2006/wordprocessingDrawing" xmlns:w10="urn:schemas-microsoft-com:office:word" xmlns:w="http://schemas.openxmlformats.org/wordprocessingml/2006/main" xmlns:w14="http://schemas.microsoft.com/office/word/2010/wordml" xmlns:w15="http://schemas.microsoft.com/office/word/2012/wordml" xmlns:w16cex="http://schemas.microsoft.com/office/word/2018/wordml/cex" xmlns:w16cid="http://schemas.microsoft.com/office/word/2016/wordml/cid" xmlns:w16="http://schemas.microsoft.com/office/word/2018/wordml" xmlns:w16du="http://schemas.microsoft.com/office/word/2023/wordml/word16du" xmlns:w16sdtdh="http://schemas.microsoft.com/office/word/2020/wordml/sdtdatahash" xmlns:w16sdtfl="http://schemas.microsoft.com/office/word/2024/wordml/sdtformatlock" xmlns:w16se="http://schemas.microsoft.com/office/word/2015/wordml/symex" xmlns:wpg="http://schemas.microsoft.com/office/word/2010/wordprocessingGroup" xmlns:wpi="http://schemas.microsoft.com/office/word/2010/wordprocessingInk" xmlns:wne="http://schemas.microsoft.com/office/word/2006/wordml" xmlns:wps="http://schemas.microsoft.com/office/word/2010/wordprocessingShape" mc:Ignorable="w14 w15 w16se w16cid w16 w16cex w16sdtdh w16sdtfl w16du wp14">
+<w:numbering xmlns:wpc="http://schemas.microsoft.com/office/word/2010/wordprocessingCanvas" xmlns:cx="http://schemas.microsoft.com/office/drawing/2014/chartex" xmlns:cx1="http://schemas.microsoft.com/office/drawing/2015/9/8/chartex" xmlns:cx2="http://schemas.microsoft.com/office/drawing/2015/10/21/chartex" xmlns:cx3="http://schemas.microsoft.com/office/drawing/2016/5/9/chartex" xmlns:cx4="http://schemas.microsoft.com/office/drawing/2016/5/10/chartex" xmlns:cx5="http://schemas.microsoft.com/office/drawing/2016/5/11/chartex" xmlns:cx6="http://schemas.microsoft.com/office/drawing/2016/5/12/chartex" xmlns:cx7="http://schemas.microsoft.com/office/drawing/2016/5/13/chartex" xmlns:cx8="http://schemas.microsoft.com/office/drawing/2016/5/14/chartex" xmlns:mc="http://schemas.openxmlformats.org/markup-compatibility/2006" xmlns:aink="http://schemas.microsoft.com/office/drawing/2016/ink" xmlns:am3d="http://schemas.microsoft.com/office/drawing/2017/model3d" xmlns:o="urn:schemas-microsoft-com:office:office" xmlns:r="http://schemas.openxmlformats.org/officeDocument/2006/relationships" xmlns:m="http://schemas.openxmlformats.org/officeDocument/2006/math" xmlns:v="urn:schemas-microsoft-com:vml" xmlns:wp14="http://schemas.microsoft.com/office/word/2010/wordprocessingDrawing" xmlns:wp="http://schemas.openxmlformats.org/drawingml/2006/wordprocessingDrawing" xmlns:w10="urn:schemas-microsoft-com:office:word" xmlns:w="http://schemas.openxmlformats.org/wordprocessingml/2006/main" xmlns:w14="http://schemas.microsoft.com/office/word/2010/wordml" xmlns:w15="http://schemas.microsoft.com/office/word/2012/wordml" xmlns:w16cex="http://schemas.microsoft.com/office/word/2018/wordml/cex" xmlns:w16cid="http://schemas.microsoft.com/office/word/2016/wordml/cid" xmlns:w16="http://schemas.microsoft.com/office/word/2018/wordml" xmlns:w16sdtdh="http://schemas.microsoft.com/office/word/2020/wordml/sdtdatahash" xmlns:w16se="http://schemas.microsoft.com/office/word/2015/wordml/symex" xmlns:wpg="http://schemas.microsoft.com/office/word/2010/wordprocessingGroup" xmlns:wpi="http://schemas.microsoft.com/office/word/2010/wordprocessingInk" xmlns:wne="http://schemas.microsoft.com/office/word/2006/wordml" xmlns:wps="http://schemas.microsoft.com/office/word/2010/wordprocessingShape" mc:Ignorable="w14 w15 w16se w16cid w16 w16cex w16sdtdh wp14">
   <w:abstractNum w:abstractNumId="0" w15:restartNumberingAfterBreak="0">
     <w:nsid w:val="3EDB08E2"/>
     <w:multiLevelType w:val="multilevel"/>
@@ -2835,14 +3367,14 @@
       </w:rPr>
     </w:lvl>
   </w:abstractNum>
-  <w:num w:numId="1" w16cid:durableId="1900630570">
+  <w:num w:numId="1">
     <w:abstractNumId w:val="0"/>
   </w:num>
 </w:numbering>
 </file>
 
 <file path=word/styles.xml><?xml version="1.0" encoding="utf-8"?>
-<w:styles xmlns:mc="http://schemas.openxmlformats.org/markup-compatibility/2006" xmlns:r="http://schemas.openxmlformats.org/officeDocument/2006/relationships" xmlns:w="http://schemas.openxmlformats.org/wordprocessingml/2006/main" xmlns:w14="http://schemas.microsoft.com/office/word/2010/wordml" xmlns:w15="http://schemas.microsoft.com/office/word/2012/wordml" xmlns:w16cex="http://schemas.microsoft.com/office/word/2018/wordml/cex" xmlns:w16cid="http://schemas.microsoft.com/office/word/2016/wordml/cid" xmlns:w16="http://schemas.microsoft.com/office/word/2018/wordml" xmlns:w16du="http://schemas.microsoft.com/office/word/2023/wordml/word16du" xmlns:w16sdtdh="http://schemas.microsoft.com/office/word/2020/wordml/sdtdatahash" xmlns:w16sdtfl="http://schemas.microsoft.com/office/word/2024/wordml/sdtformatlock" xmlns:w16se="http://schemas.microsoft.com/office/word/2015/wordml/symex" mc:Ignorable="w14 w15 w16se w16cid w16 w16cex w16sdtdh w16sdtfl w16du">
+<w:styles xmlns:mc="http://schemas.openxmlformats.org/markup-compatibility/2006" xmlns:r="http://schemas.openxmlformats.org/officeDocument/2006/relationships" xmlns:w="http://schemas.openxmlformats.org/wordprocessingml/2006/main" xmlns:w14="http://schemas.microsoft.com/office/word/2010/wordml" xmlns:w15="http://schemas.microsoft.com/office/word/2012/wordml" xmlns:w16cex="http://schemas.microsoft.com/office/word/2018/wordml/cex" xmlns:w16cid="http://schemas.microsoft.com/office/word/2016/wordml/cid" xmlns:w16="http://schemas.microsoft.com/office/word/2018/wordml" xmlns:w16sdtdh="http://schemas.microsoft.com/office/word/2020/wordml/sdtdatahash" xmlns:w16se="http://schemas.microsoft.com/office/word/2015/wordml/symex" mc:Ignorable="w14 w15 w16se w16cid w16 w16cex w16sdtdh">
   <w:docDefaults>
     <w:rPrDefault>
       <w:rPr>
@@ -3238,15 +3770,15 @@
     <w:lsdException w:name="Unresolved Mention" w:semiHidden="1" w:unhideWhenUsed="1"/>
     <w:lsdException w:name="Smart Link" w:semiHidden="1" w:unhideWhenUsed="1"/>
   </w:latentStyles>
-  <w:style w:type="paragraph" w:default="1" w:styleId="Normal">
+  <w:style w:type="paragraph" w:default="1" w:styleId="a">
     <w:name w:val="Normal"/>
     <w:qFormat/>
   </w:style>
-  <w:style w:type="paragraph" w:styleId="Heading1">
+  <w:style w:type="paragraph" w:styleId="1">
     <w:name w:val="heading 1"/>
-    <w:basedOn w:val="Normal"/>
-    <w:next w:val="Normal"/>
-    <w:link w:val="Heading1Char"/>
+    <w:basedOn w:val="a"/>
+    <w:next w:val="a"/>
+    <w:link w:val="10"/>
     <w:uiPriority w:val="9"/>
     <w:qFormat/>
     <w:rsid w:val="0038282C"/>
@@ -3263,11 +3795,11 @@
       <w:szCs w:val="40"/>
     </w:rPr>
   </w:style>
-  <w:style w:type="paragraph" w:styleId="Heading2">
+  <w:style w:type="paragraph" w:styleId="2">
     <w:name w:val="heading 2"/>
-    <w:basedOn w:val="Normal"/>
-    <w:next w:val="Normal"/>
-    <w:link w:val="Heading2Char"/>
+    <w:basedOn w:val="a"/>
+    <w:next w:val="a"/>
+    <w:link w:val="20"/>
     <w:uiPriority w:val="9"/>
     <w:semiHidden/>
     <w:unhideWhenUsed/>
@@ -3286,11 +3818,11 @@
       <w:szCs w:val="32"/>
     </w:rPr>
   </w:style>
-  <w:style w:type="paragraph" w:styleId="Heading3">
+  <w:style w:type="paragraph" w:styleId="3">
     <w:name w:val="heading 3"/>
-    <w:basedOn w:val="Normal"/>
-    <w:next w:val="Normal"/>
-    <w:link w:val="Heading3Char"/>
+    <w:basedOn w:val="a"/>
+    <w:next w:val="a"/>
+    <w:link w:val="30"/>
     <w:uiPriority w:val="9"/>
     <w:semiHidden/>
     <w:unhideWhenUsed/>
@@ -3309,11 +3841,11 @@
       <w:szCs w:val="28"/>
     </w:rPr>
   </w:style>
-  <w:style w:type="paragraph" w:styleId="Heading4">
+  <w:style w:type="paragraph" w:styleId="4">
     <w:name w:val="heading 4"/>
-    <w:basedOn w:val="Normal"/>
-    <w:next w:val="Normal"/>
-    <w:link w:val="Heading4Char"/>
+    <w:basedOn w:val="a"/>
+    <w:next w:val="a"/>
+    <w:link w:val="40"/>
     <w:uiPriority w:val="9"/>
     <w:semiHidden/>
     <w:unhideWhenUsed/>
@@ -3332,11 +3864,11 @@
       <w:color w:val="2E74B5" w:themeColor="accent1" w:themeShade="BF"/>
     </w:rPr>
   </w:style>
-  <w:style w:type="paragraph" w:styleId="Heading5">
+  <w:style w:type="paragraph" w:styleId="5">
     <w:name w:val="heading 5"/>
-    <w:basedOn w:val="Normal"/>
-    <w:next w:val="Normal"/>
-    <w:link w:val="Heading5Char"/>
+    <w:basedOn w:val="a"/>
+    <w:next w:val="a"/>
+    <w:link w:val="50"/>
     <w:uiPriority w:val="9"/>
     <w:semiHidden/>
     <w:unhideWhenUsed/>
@@ -3353,11 +3885,11 @@
       <w:color w:val="2E74B5" w:themeColor="accent1" w:themeShade="BF"/>
     </w:rPr>
   </w:style>
-  <w:style w:type="paragraph" w:styleId="Heading6">
+  <w:style w:type="paragraph" w:styleId="6">
     <w:name w:val="heading 6"/>
-    <w:basedOn w:val="Normal"/>
-    <w:next w:val="Normal"/>
-    <w:link w:val="Heading6Char"/>
+    <w:basedOn w:val="a"/>
+    <w:next w:val="a"/>
+    <w:link w:val="60"/>
     <w:uiPriority w:val="9"/>
     <w:semiHidden/>
     <w:unhideWhenUsed/>
@@ -3376,11 +3908,11 @@
       <w:color w:val="595959" w:themeColor="text1" w:themeTint="A6"/>
     </w:rPr>
   </w:style>
-  <w:style w:type="paragraph" w:styleId="Heading7">
+  <w:style w:type="paragraph" w:styleId="7">
     <w:name w:val="heading 7"/>
-    <w:basedOn w:val="Normal"/>
-    <w:next w:val="Normal"/>
-    <w:link w:val="Heading7Char"/>
+    <w:basedOn w:val="a"/>
+    <w:next w:val="a"/>
+    <w:link w:val="70"/>
     <w:uiPriority w:val="9"/>
     <w:semiHidden/>
     <w:unhideWhenUsed/>
@@ -3397,11 +3929,11 @@
       <w:color w:val="595959" w:themeColor="text1" w:themeTint="A6"/>
     </w:rPr>
   </w:style>
-  <w:style w:type="paragraph" w:styleId="Heading8">
+  <w:style w:type="paragraph" w:styleId="8">
     <w:name w:val="heading 8"/>
-    <w:basedOn w:val="Normal"/>
-    <w:next w:val="Normal"/>
-    <w:link w:val="Heading8Char"/>
+    <w:basedOn w:val="a"/>
+    <w:next w:val="a"/>
+    <w:link w:val="80"/>
     <w:uiPriority w:val="9"/>
     <w:semiHidden/>
     <w:unhideWhenUsed/>
@@ -3420,11 +3952,11 @@
       <w:color w:val="272727" w:themeColor="text1" w:themeTint="D8"/>
     </w:rPr>
   </w:style>
-  <w:style w:type="paragraph" w:styleId="Heading9">
+  <w:style w:type="paragraph" w:styleId="9">
     <w:name w:val="heading 9"/>
-    <w:basedOn w:val="Normal"/>
-    <w:next w:val="Normal"/>
-    <w:link w:val="Heading9Char"/>
+    <w:basedOn w:val="a"/>
+    <w:next w:val="a"/>
+    <w:link w:val="90"/>
     <w:uiPriority w:val="9"/>
     <w:semiHidden/>
     <w:unhideWhenUsed/>
@@ -3441,12 +3973,13 @@
       <w:color w:val="272727" w:themeColor="text1" w:themeTint="D8"/>
     </w:rPr>
   </w:style>
-  <w:style w:type="character" w:default="1" w:styleId="DefaultParagraphFont">
+  <w:style w:type="character" w:default="1" w:styleId="a0">
     <w:name w:val="Default Paragraph Font"/>
     <w:uiPriority w:val="1"/>
+    <w:semiHidden/>
     <w:unhideWhenUsed/>
   </w:style>
-  <w:style w:type="table" w:default="1" w:styleId="TableNormal">
+  <w:style w:type="table" w:default="1" w:styleId="a1">
     <w:name w:val="Normal Table"/>
     <w:uiPriority w:val="99"/>
     <w:semiHidden/>
@@ -3461,16 +3994,16 @@
       </w:tblCellMar>
     </w:tblPr>
   </w:style>
-  <w:style w:type="numbering" w:default="1" w:styleId="NoList">
+  <w:style w:type="numbering" w:default="1" w:styleId="a2">
     <w:name w:val="No List"/>
     <w:uiPriority w:val="99"/>
     <w:semiHidden/>
     <w:unhideWhenUsed/>
   </w:style>
-  <w:style w:type="character" w:customStyle="1" w:styleId="Heading1Char">
-    <w:name w:val="Heading 1 Char"/>
-    <w:basedOn w:val="DefaultParagraphFont"/>
-    <w:link w:val="Heading1"/>
+  <w:style w:type="character" w:customStyle="1" w:styleId="10">
+    <w:name w:val="标题 1 字符"/>
+    <w:basedOn w:val="a0"/>
+    <w:link w:val="1"/>
     <w:uiPriority w:val="9"/>
     <w:rsid w:val="0038282C"/>
     <w:rPr>
@@ -3480,10 +4013,10 @@
       <w:szCs w:val="40"/>
     </w:rPr>
   </w:style>
-  <w:style w:type="character" w:customStyle="1" w:styleId="Heading2Char">
-    <w:name w:val="Heading 2 Char"/>
-    <w:basedOn w:val="DefaultParagraphFont"/>
-    <w:link w:val="Heading2"/>
+  <w:style w:type="character" w:customStyle="1" w:styleId="20">
+    <w:name w:val="标题 2 字符"/>
+    <w:basedOn w:val="a0"/>
+    <w:link w:val="2"/>
     <w:uiPriority w:val="9"/>
     <w:semiHidden/>
     <w:rsid w:val="0038282C"/>
@@ -3494,10 +4027,10 @@
       <w:szCs w:val="32"/>
     </w:rPr>
   </w:style>
-  <w:style w:type="character" w:customStyle="1" w:styleId="Heading3Char">
-    <w:name w:val="Heading 3 Char"/>
-    <w:basedOn w:val="DefaultParagraphFont"/>
-    <w:link w:val="Heading3"/>
+  <w:style w:type="character" w:customStyle="1" w:styleId="30">
+    <w:name w:val="标题 3 字符"/>
+    <w:basedOn w:val="a0"/>
+    <w:link w:val="3"/>
     <w:uiPriority w:val="9"/>
     <w:semiHidden/>
     <w:rsid w:val="0038282C"/>
@@ -3508,10 +4041,10 @@
       <w:szCs w:val="28"/>
     </w:rPr>
   </w:style>
-  <w:style w:type="character" w:customStyle="1" w:styleId="Heading4Char">
-    <w:name w:val="Heading 4 Char"/>
-    <w:basedOn w:val="DefaultParagraphFont"/>
-    <w:link w:val="Heading4"/>
+  <w:style w:type="character" w:customStyle="1" w:styleId="40">
+    <w:name w:val="标题 4 字符"/>
+    <w:basedOn w:val="a0"/>
+    <w:link w:val="4"/>
     <w:uiPriority w:val="9"/>
     <w:semiHidden/>
     <w:rsid w:val="0038282C"/>
@@ -3522,10 +4055,10 @@
       <w:color w:val="2E74B5" w:themeColor="accent1" w:themeShade="BF"/>
     </w:rPr>
   </w:style>
-  <w:style w:type="character" w:customStyle="1" w:styleId="Heading5Char">
-    <w:name w:val="Heading 5 Char"/>
-    <w:basedOn w:val="DefaultParagraphFont"/>
-    <w:link w:val="Heading5"/>
+  <w:style w:type="character" w:customStyle="1" w:styleId="50">
+    <w:name w:val="标题 5 字符"/>
+    <w:basedOn w:val="a0"/>
+    <w:link w:val="5"/>
     <w:uiPriority w:val="9"/>
     <w:semiHidden/>
     <w:rsid w:val="0038282C"/>
@@ -3534,10 +4067,10 @@
       <w:color w:val="2E74B5" w:themeColor="accent1" w:themeShade="BF"/>
     </w:rPr>
   </w:style>
-  <w:style w:type="character" w:customStyle="1" w:styleId="Heading6Char">
-    <w:name w:val="Heading 6 Char"/>
-    <w:basedOn w:val="DefaultParagraphFont"/>
-    <w:link w:val="Heading6"/>
+  <w:style w:type="character" w:customStyle="1" w:styleId="60">
+    <w:name w:val="标题 6 字符"/>
+    <w:basedOn w:val="a0"/>
+    <w:link w:val="6"/>
     <w:uiPriority w:val="9"/>
     <w:semiHidden/>
     <w:rsid w:val="0038282C"/>
@@ -3548,10 +4081,10 @@
       <w:color w:val="595959" w:themeColor="text1" w:themeTint="A6"/>
     </w:rPr>
   </w:style>
-  <w:style w:type="character" w:customStyle="1" w:styleId="Heading7Char">
-    <w:name w:val="Heading 7 Char"/>
-    <w:basedOn w:val="DefaultParagraphFont"/>
-    <w:link w:val="Heading7"/>
+  <w:style w:type="character" w:customStyle="1" w:styleId="70">
+    <w:name w:val="标题 7 字符"/>
+    <w:basedOn w:val="a0"/>
+    <w:link w:val="7"/>
     <w:uiPriority w:val="9"/>
     <w:semiHidden/>
     <w:rsid w:val="0038282C"/>
@@ -3560,10 +4093,10 @@
       <w:color w:val="595959" w:themeColor="text1" w:themeTint="A6"/>
     </w:rPr>
   </w:style>
-  <w:style w:type="character" w:customStyle="1" w:styleId="Heading8Char">
-    <w:name w:val="Heading 8 Char"/>
-    <w:basedOn w:val="DefaultParagraphFont"/>
-    <w:link w:val="Heading8"/>
+  <w:style w:type="character" w:customStyle="1" w:styleId="80">
+    <w:name w:val="标题 8 字符"/>
+    <w:basedOn w:val="a0"/>
+    <w:link w:val="8"/>
     <w:uiPriority w:val="9"/>
     <w:semiHidden/>
     <w:rsid w:val="0038282C"/>
@@ -3574,10 +4107,10 @@
       <w:color w:val="272727" w:themeColor="text1" w:themeTint="D8"/>
     </w:rPr>
   </w:style>
-  <w:style w:type="character" w:customStyle="1" w:styleId="Heading9Char">
-    <w:name w:val="Heading 9 Char"/>
-    <w:basedOn w:val="DefaultParagraphFont"/>
-    <w:link w:val="Heading9"/>
+  <w:style w:type="character" w:customStyle="1" w:styleId="90">
+    <w:name w:val="标题 9 字符"/>
+    <w:basedOn w:val="a0"/>
+    <w:link w:val="9"/>
     <w:uiPriority w:val="9"/>
     <w:semiHidden/>
     <w:rsid w:val="0038282C"/>
@@ -3586,11 +4119,11 @@
       <w:color w:val="272727" w:themeColor="text1" w:themeTint="D8"/>
     </w:rPr>
   </w:style>
-  <w:style w:type="paragraph" w:styleId="Title">
+  <w:style w:type="paragraph" w:styleId="a3">
     <w:name w:val="Title"/>
-    <w:basedOn w:val="Normal"/>
-    <w:next w:val="Normal"/>
-    <w:link w:val="TitleChar"/>
+    <w:basedOn w:val="a"/>
+    <w:next w:val="a"/>
+    <w:link w:val="a4"/>
     <w:uiPriority w:val="10"/>
     <w:qFormat/>
     <w:rsid w:val="0038282C"/>
@@ -3606,10 +4139,10 @@
       <w:szCs w:val="56"/>
     </w:rPr>
   </w:style>
-  <w:style w:type="character" w:customStyle="1" w:styleId="TitleChar">
-    <w:name w:val="Title Char"/>
-    <w:basedOn w:val="DefaultParagraphFont"/>
-    <w:link w:val="Title"/>
+  <w:style w:type="character" w:customStyle="1" w:styleId="a4">
+    <w:name w:val="标题 字符"/>
+    <w:basedOn w:val="a0"/>
+    <w:link w:val="a3"/>
     <w:uiPriority w:val="10"/>
     <w:rsid w:val="0038282C"/>
     <w:rPr>
@@ -3620,11 +4153,11 @@
       <w:szCs w:val="56"/>
     </w:rPr>
   </w:style>
-  <w:style w:type="paragraph" w:styleId="Subtitle">
+  <w:style w:type="paragraph" w:styleId="a5">
     <w:name w:val="Subtitle"/>
-    <w:basedOn w:val="Normal"/>
-    <w:next w:val="Normal"/>
-    <w:link w:val="SubtitleChar"/>
+    <w:basedOn w:val="a"/>
+    <w:next w:val="a"/>
+    <w:link w:val="a6"/>
     <w:uiPriority w:val="11"/>
     <w:qFormat/>
     <w:rsid w:val="0038282C"/>
@@ -3641,10 +4174,10 @@
       <w:szCs w:val="28"/>
     </w:rPr>
   </w:style>
-  <w:style w:type="character" w:customStyle="1" w:styleId="SubtitleChar">
-    <w:name w:val="Subtitle Char"/>
-    <w:basedOn w:val="DefaultParagraphFont"/>
-    <w:link w:val="Subtitle"/>
+  <w:style w:type="character" w:customStyle="1" w:styleId="a6">
+    <w:name w:val="副标题 字符"/>
+    <w:basedOn w:val="a0"/>
+    <w:link w:val="a5"/>
     <w:uiPriority w:val="11"/>
     <w:rsid w:val="0038282C"/>
     <w:rPr>
@@ -3655,11 +4188,11 @@
       <w:szCs w:val="28"/>
     </w:rPr>
   </w:style>
-  <w:style w:type="paragraph" w:styleId="Quote">
+  <w:style w:type="paragraph" w:styleId="a7">
     <w:name w:val="Quote"/>
-    <w:basedOn w:val="Normal"/>
-    <w:next w:val="Normal"/>
-    <w:link w:val="QuoteChar"/>
+    <w:basedOn w:val="a"/>
+    <w:next w:val="a"/>
+    <w:link w:val="a8"/>
     <w:uiPriority w:val="29"/>
     <w:qFormat/>
     <w:rsid w:val="0038282C"/>
@@ -3673,10 +4206,10 @@
       <w:color w:val="404040" w:themeColor="text1" w:themeTint="BF"/>
     </w:rPr>
   </w:style>
-  <w:style w:type="character" w:customStyle="1" w:styleId="QuoteChar">
-    <w:name w:val="Quote Char"/>
-    <w:basedOn w:val="DefaultParagraphFont"/>
-    <w:link w:val="Quote"/>
+  <w:style w:type="character" w:customStyle="1" w:styleId="a8">
+    <w:name w:val="引用 字符"/>
+    <w:basedOn w:val="a0"/>
+    <w:link w:val="a7"/>
     <w:uiPriority w:val="29"/>
     <w:rsid w:val="0038282C"/>
     <w:rPr>
@@ -3685,9 +4218,9 @@
       <w:color w:val="404040" w:themeColor="text1" w:themeTint="BF"/>
     </w:rPr>
   </w:style>
-  <w:style w:type="paragraph" w:styleId="ListParagraph">
+  <w:style w:type="paragraph" w:styleId="a9">
     <w:name w:val="List Paragraph"/>
-    <w:basedOn w:val="Normal"/>
+    <w:basedOn w:val="a"/>
     <w:uiPriority w:val="34"/>
     <w:qFormat/>
     <w:rsid w:val="0038282C"/>
@@ -3696,9 +4229,9 @@
       <w:contextualSpacing/>
     </w:pPr>
   </w:style>
-  <w:style w:type="character" w:styleId="IntenseEmphasis">
+  <w:style w:type="character" w:styleId="aa">
     <w:name w:val="Intense Emphasis"/>
-    <w:basedOn w:val="DefaultParagraphFont"/>
+    <w:basedOn w:val="a0"/>
     <w:uiPriority w:val="21"/>
     <w:qFormat/>
     <w:rsid w:val="0038282C"/>
@@ -3708,11 +4241,11 @@
       <w:color w:val="2E74B5" w:themeColor="accent1" w:themeShade="BF"/>
     </w:rPr>
   </w:style>
-  <w:style w:type="paragraph" w:styleId="IntenseQuote">
+  <w:style w:type="paragraph" w:styleId="ab">
     <w:name w:val="Intense Quote"/>
-    <w:basedOn w:val="Normal"/>
-    <w:next w:val="Normal"/>
-    <w:link w:val="IntenseQuoteChar"/>
+    <w:basedOn w:val="a"/>
+    <w:next w:val="a"/>
+    <w:link w:val="ac"/>
     <w:uiPriority w:val="30"/>
     <w:qFormat/>
     <w:rsid w:val="0038282C"/>
@@ -3731,10 +4264,10 @@
       <w:color w:val="2E74B5" w:themeColor="accent1" w:themeShade="BF"/>
     </w:rPr>
   </w:style>
-  <w:style w:type="character" w:customStyle="1" w:styleId="IntenseQuoteChar">
-    <w:name w:val="Intense Quote Char"/>
-    <w:basedOn w:val="DefaultParagraphFont"/>
-    <w:link w:val="IntenseQuote"/>
+  <w:style w:type="character" w:customStyle="1" w:styleId="ac">
+    <w:name w:val="明显引用 字符"/>
+    <w:basedOn w:val="a0"/>
+    <w:link w:val="ab"/>
     <w:uiPriority w:val="30"/>
     <w:rsid w:val="0038282C"/>
     <w:rPr>
@@ -3743,9 +4276,9 @@
       <w:color w:val="2E74B5" w:themeColor="accent1" w:themeShade="BF"/>
     </w:rPr>
   </w:style>
-  <w:style w:type="character" w:styleId="IntenseReference">
+  <w:style w:type="character" w:styleId="ad">
     <w:name w:val="Intense Reference"/>
-    <w:basedOn w:val="DefaultParagraphFont"/>
+    <w:basedOn w:val="a0"/>
     <w:uiPriority w:val="32"/>
     <w:qFormat/>
     <w:rsid w:val="0038282C"/>
@@ -3757,10 +4290,10 @@
       <w:spacing w:val="5"/>
     </w:rPr>
   </w:style>
-  <w:style w:type="paragraph" w:styleId="Bibliography">
+  <w:style w:type="paragraph" w:styleId="ae">
     <w:name w:val="Bibliography"/>
-    <w:basedOn w:val="Normal"/>
-    <w:next w:val="Normal"/>
+    <w:basedOn w:val="a"/>
+    <w:next w:val="a"/>
     <w:uiPriority w:val="37"/>
     <w:unhideWhenUsed/>
     <w:rsid w:val="009842E2"/>

</xml_diff>